<commit_message>
docs: explain scoped uploads and image OCR
</commit_message>
<xml_diff>
--- a/docs/Руководство_пользователя_RAG_Assistant.docx
+++ b/docs/Руководство_пользователя_RAG_Assistant.docx
@@ -1151,16 +1151,7 @@
           <w:rFonts w:ascii="Aptos" w:hAnsi="Aptos" w:eastAsia="Aptos"/>
           <w:b w:val="0"/>
         </w:rPr>
-        <w:t xml:space="preserve"> — поиск идёт одновременно по приватным документам</w:t>
-      </w:r>
-    </w:p>
-    <w:p>
-      <w:r>
-        <w:rPr>
-          <w:rFonts w:ascii="Aptos" w:hAnsi="Aptos" w:eastAsia="Aptos"/>
-          <w:b w:val="0"/>
-        </w:rPr>
-        <w:t>текущего проекта и по общим документам.</w:t>
+        <w:t xml:space="preserve"> — поиск идёт одновременно по приватным документам текущего проекта и по общим документам.</w:t>
       </w:r>
     </w:p>
     <w:p>
@@ -1502,7 +1493,55 @@
           <w:rFonts w:ascii="Aptos" w:hAnsi="Aptos" w:eastAsia="Aptos"/>
           <w:b w:val="0"/>
         </w:rPr>
-        <w:t>В правой панели выберите файлы.</w:t>
+        <w:t xml:space="preserve">Нажмите кнопку </w:t>
+      </w:r>
+      <w:r>
+        <w:rPr>
+          <w:rFonts w:ascii="Cascadia Mono" w:hAnsi="Cascadia Mono" w:eastAsia="Cascadia Mono"/>
+          <w:color w:val="17324D"/>
+          <w:sz w:val="18"/>
+          <w:shd w:fill="F3F5F7"/>
+        </w:rPr>
+        <w:t>+</w:t>
+      </w:r>
+      <w:r>
+        <w:rPr>
+          <w:rFonts w:ascii="Aptos" w:hAnsi="Aptos" w:eastAsia="Aptos"/>
+          <w:b w:val="0"/>
+        </w:rPr>
+        <w:t xml:space="preserve"> слева от поля </w:t>
+      </w:r>
+      <w:r>
+        <w:rPr>
+          <w:rFonts w:ascii="Cascadia Mono" w:hAnsi="Cascadia Mono" w:eastAsia="Cascadia Mono"/>
+          <w:color w:val="17324D"/>
+          <w:sz w:val="18"/>
+          <w:shd w:fill="F3F5F7"/>
+        </w:rPr>
+        <w:t>Введите вопрос</w:t>
+      </w:r>
+      <w:r>
+        <w:rPr>
+          <w:rFonts w:ascii="Aptos" w:hAnsi="Aptos" w:eastAsia="Aptos"/>
+          <w:b w:val="0"/>
+        </w:rPr>
+        <w:t xml:space="preserve">. Откроется панель </w:t>
+      </w:r>
+      <w:r>
+        <w:rPr>
+          <w:rFonts w:ascii="Cascadia Mono" w:hAnsi="Cascadia Mono" w:eastAsia="Cascadia Mono"/>
+          <w:color w:val="17324D"/>
+          <w:sz w:val="18"/>
+          <w:shd w:fill="F3F5F7"/>
+        </w:rPr>
+        <w:t>Добавить в контекст</w:t>
+      </w:r>
+      <w:r>
+        <w:rPr>
+          <w:rFonts w:ascii="Aptos" w:hAnsi="Aptos" w:eastAsia="Aptos"/>
+          <w:b w:val="0"/>
+        </w:rPr>
+        <w:t>.</w:t>
       </w:r>
     </w:p>
     <w:p>
@@ -1522,7 +1561,74 @@
           <w:rFonts w:ascii="Aptos" w:hAnsi="Aptos" w:eastAsia="Aptos"/>
           <w:b w:val="0"/>
         </w:rPr>
-        <w:t>Проверьте, что выбрана правильная рабочая область. Файл будет привязан к текущему проекту/чату и останется приватным для текущего пользователя.</w:t>
+        <w:t>Выберите область использования:</w:t>
+      </w:r>
+    </w:p>
+    <w:p>
+      <w:pPr>
+        <w:pStyle w:val="ListBullet2"/>
+      </w:pPr>
+      <w:r>
+        <w:rPr>
+          <w:rFonts w:ascii="Cascadia Mono" w:hAnsi="Cascadia Mono" w:eastAsia="Cascadia Mono"/>
+          <w:color w:val="17324D"/>
+          <w:sz w:val="18"/>
+          <w:shd w:fill="F3F5F7"/>
+        </w:rPr>
+        <w:t>Только в этом чате</w:t>
+      </w:r>
+      <w:r>
+        <w:rPr>
+          <w:rFonts w:ascii="Aptos" w:hAnsi="Aptos" w:eastAsia="Aptos"/>
+          <w:b w:val="0"/>
+        </w:rPr>
+        <w:t xml:space="preserve"> — файл будет доступен только в открытой ветке;</w:t>
+      </w:r>
+    </w:p>
+    <w:p>
+      <w:pPr>
+        <w:pStyle w:val="ListBullet2"/>
+      </w:pPr>
+      <w:r>
+        <w:rPr>
+          <w:rFonts w:ascii="Cascadia Mono" w:hAnsi="Cascadia Mono" w:eastAsia="Cascadia Mono"/>
+          <w:color w:val="17324D"/>
+          <w:sz w:val="18"/>
+          <w:shd w:fill="F3F5F7"/>
+        </w:rPr>
+        <w:t>Во всём проекте</w:t>
+      </w:r>
+      <w:r>
+        <w:rPr>
+          <w:rFonts w:ascii="Aptos" w:hAnsi="Aptos" w:eastAsia="Aptos"/>
+          <w:b w:val="0"/>
+        </w:rPr>
+        <w:t xml:space="preserve"> — файл смогут использовать все чаты текущего проекта.</w:t>
+      </w:r>
+    </w:p>
+    <w:p>
+      <w:r>
+        <w:rPr>
+          <w:rFonts w:ascii="Aptos" w:hAnsi="Aptos" w:eastAsia="Aptos"/>
+          <w:b w:val="0"/>
+        </w:rPr>
+        <w:t xml:space="preserve">Файл в обоих случаях остаётся приватным для владельца проекта. В свободном чате доступен только вариант </w:t>
+      </w:r>
+      <w:r>
+        <w:rPr>
+          <w:rFonts w:ascii="Cascadia Mono" w:hAnsi="Cascadia Mono" w:eastAsia="Cascadia Mono"/>
+          <w:color w:val="17324D"/>
+          <w:sz w:val="18"/>
+          <w:shd w:fill="F3F5F7"/>
+        </w:rPr>
+        <w:t>Только в этом чате</w:t>
+      </w:r>
+      <w:r>
+        <w:rPr>
+          <w:rFonts w:ascii="Aptos" w:hAnsi="Aptos" w:eastAsia="Aptos"/>
+          <w:b w:val="0"/>
+        </w:rPr>
+        <w:t>.</w:t>
       </w:r>
     </w:p>
     <w:p>
@@ -1542,7 +1648,215 @@
           <w:rFonts w:ascii="Aptos" w:hAnsi="Aptos" w:eastAsia="Aptos"/>
           <w:b w:val="0"/>
         </w:rPr>
-        <w:t>Нажмите загрузку. API быстро примет файл и поставит его в очередь.</w:t>
+        <w:t xml:space="preserve">Нажмите карточку </w:t>
+      </w:r>
+      <w:r>
+        <w:rPr>
+          <w:rFonts w:ascii="Cascadia Mono" w:hAnsi="Cascadia Mono" w:eastAsia="Cascadia Mono"/>
+          <w:color w:val="17324D"/>
+          <w:sz w:val="18"/>
+          <w:shd w:fill="F3F5F7"/>
+        </w:rPr>
+        <w:t>Документ</w:t>
+      </w:r>
+      <w:r>
+        <w:rPr>
+          <w:rFonts w:ascii="Aptos" w:hAnsi="Aptos" w:eastAsia="Aptos"/>
+          <w:b w:val="0"/>
+        </w:rPr>
+        <w:t xml:space="preserve"> для </w:t>
+      </w:r>
+      <w:r>
+        <w:rPr>
+          <w:rFonts w:ascii="Cascadia Mono" w:hAnsi="Cascadia Mono" w:eastAsia="Cascadia Mono"/>
+          <w:color w:val="17324D"/>
+          <w:sz w:val="18"/>
+          <w:shd w:fill="F3F5F7"/>
+        </w:rPr>
+        <w:t>.docx</w:t>
+      </w:r>
+      <w:r>
+        <w:rPr>
+          <w:rFonts w:ascii="Aptos" w:hAnsi="Aptos" w:eastAsia="Aptos"/>
+          <w:b w:val="0"/>
+        </w:rPr>
+        <w:t xml:space="preserve">, </w:t>
+      </w:r>
+      <w:r>
+        <w:rPr>
+          <w:rFonts w:ascii="Cascadia Mono" w:hAnsi="Cascadia Mono" w:eastAsia="Cascadia Mono"/>
+          <w:color w:val="17324D"/>
+          <w:sz w:val="18"/>
+          <w:shd w:fill="F3F5F7"/>
+        </w:rPr>
+        <w:t>.pdf</w:t>
+      </w:r>
+      <w:r>
+        <w:rPr>
+          <w:rFonts w:ascii="Aptos" w:hAnsi="Aptos" w:eastAsia="Aptos"/>
+          <w:b w:val="0"/>
+        </w:rPr>
+        <w:t xml:space="preserve">, </w:t>
+      </w:r>
+      <w:r>
+        <w:rPr>
+          <w:rFonts w:ascii="Cascadia Mono" w:hAnsi="Cascadia Mono" w:eastAsia="Cascadia Mono"/>
+          <w:color w:val="17324D"/>
+          <w:sz w:val="18"/>
+          <w:shd w:fill="F3F5F7"/>
+        </w:rPr>
+        <w:t>.md</w:t>
+      </w:r>
+      <w:r>
+        <w:rPr>
+          <w:rFonts w:ascii="Aptos" w:hAnsi="Aptos" w:eastAsia="Aptos"/>
+          <w:b w:val="0"/>
+        </w:rPr>
+        <w:t xml:space="preserve"> или </w:t>
+      </w:r>
+      <w:r>
+        <w:rPr>
+          <w:rFonts w:ascii="Cascadia Mono" w:hAnsi="Cascadia Mono" w:eastAsia="Cascadia Mono"/>
+          <w:color w:val="17324D"/>
+          <w:sz w:val="18"/>
+          <w:shd w:fill="F3F5F7"/>
+        </w:rPr>
+        <w:t>.txt</w:t>
+      </w:r>
+      <w:r>
+        <w:rPr>
+          <w:rFonts w:ascii="Aptos" w:hAnsi="Aptos" w:eastAsia="Aptos"/>
+          <w:b w:val="0"/>
+        </w:rPr>
+        <w:t xml:space="preserve"> либо карточку </w:t>
+      </w:r>
+      <w:r>
+        <w:rPr>
+          <w:rFonts w:ascii="Cascadia Mono" w:hAnsi="Cascadia Mono" w:eastAsia="Cascadia Mono"/>
+          <w:color w:val="17324D"/>
+          <w:sz w:val="18"/>
+          <w:shd w:fill="F3F5F7"/>
+        </w:rPr>
+        <w:t>Изображение</w:t>
+      </w:r>
+      <w:r>
+        <w:rPr>
+          <w:rFonts w:ascii="Aptos" w:hAnsi="Aptos" w:eastAsia="Aptos"/>
+          <w:b w:val="0"/>
+        </w:rPr>
+        <w:t xml:space="preserve"> для </w:t>
+      </w:r>
+      <w:r>
+        <w:rPr>
+          <w:rFonts w:ascii="Cascadia Mono" w:hAnsi="Cascadia Mono" w:eastAsia="Cascadia Mono"/>
+          <w:color w:val="17324D"/>
+          <w:sz w:val="18"/>
+          <w:shd w:fill="F3F5F7"/>
+        </w:rPr>
+        <w:t>.png</w:t>
+      </w:r>
+      <w:r>
+        <w:rPr>
+          <w:rFonts w:ascii="Aptos" w:hAnsi="Aptos" w:eastAsia="Aptos"/>
+          <w:b w:val="0"/>
+        </w:rPr>
+        <w:t xml:space="preserve">, </w:t>
+      </w:r>
+      <w:r>
+        <w:rPr>
+          <w:rFonts w:ascii="Cascadia Mono" w:hAnsi="Cascadia Mono" w:eastAsia="Cascadia Mono"/>
+          <w:color w:val="17324D"/>
+          <w:sz w:val="18"/>
+          <w:shd w:fill="F3F5F7"/>
+        </w:rPr>
+        <w:t>.jpg</w:t>
+      </w:r>
+      <w:r>
+        <w:rPr>
+          <w:rFonts w:ascii="Aptos" w:hAnsi="Aptos" w:eastAsia="Aptos"/>
+          <w:b w:val="0"/>
+        </w:rPr>
+        <w:t xml:space="preserve">, </w:t>
+      </w:r>
+      <w:r>
+        <w:rPr>
+          <w:rFonts w:ascii="Cascadia Mono" w:hAnsi="Cascadia Mono" w:eastAsia="Cascadia Mono"/>
+          <w:color w:val="17324D"/>
+          <w:sz w:val="18"/>
+          <w:shd w:fill="F3F5F7"/>
+        </w:rPr>
+        <w:t>.jpeg</w:t>
+      </w:r>
+      <w:r>
+        <w:rPr>
+          <w:rFonts w:ascii="Aptos" w:hAnsi="Aptos" w:eastAsia="Aptos"/>
+          <w:b w:val="0"/>
+        </w:rPr>
+        <w:t xml:space="preserve">, </w:t>
+      </w:r>
+      <w:r>
+        <w:rPr>
+          <w:rFonts w:ascii="Cascadia Mono" w:hAnsi="Cascadia Mono" w:eastAsia="Cascadia Mono"/>
+          <w:color w:val="17324D"/>
+          <w:sz w:val="18"/>
+          <w:shd w:fill="F3F5F7"/>
+        </w:rPr>
+        <w:t>.webp</w:t>
+      </w:r>
+      <w:r>
+        <w:rPr>
+          <w:rFonts w:ascii="Aptos" w:hAnsi="Aptos" w:eastAsia="Aptos"/>
+          <w:b w:val="0"/>
+        </w:rPr>
+        <w:t xml:space="preserve">, </w:t>
+      </w:r>
+      <w:r>
+        <w:rPr>
+          <w:rFonts w:ascii="Cascadia Mono" w:hAnsi="Cascadia Mono" w:eastAsia="Cascadia Mono"/>
+          <w:color w:val="17324D"/>
+          <w:sz w:val="18"/>
+          <w:shd w:fill="F3F5F7"/>
+        </w:rPr>
+        <w:t>.tif</w:t>
+      </w:r>
+      <w:r>
+        <w:rPr>
+          <w:rFonts w:ascii="Aptos" w:hAnsi="Aptos" w:eastAsia="Aptos"/>
+          <w:b w:val="0"/>
+        </w:rPr>
+        <w:t xml:space="preserve">, </w:t>
+      </w:r>
+      <w:r>
+        <w:rPr>
+          <w:rFonts w:ascii="Cascadia Mono" w:hAnsi="Cascadia Mono" w:eastAsia="Cascadia Mono"/>
+          <w:color w:val="17324D"/>
+          <w:sz w:val="18"/>
+          <w:shd w:fill="F3F5F7"/>
+        </w:rPr>
+        <w:t>.tiff</w:t>
+      </w:r>
+      <w:r>
+        <w:rPr>
+          <w:rFonts w:ascii="Aptos" w:hAnsi="Aptos" w:eastAsia="Aptos"/>
+          <w:b w:val="0"/>
+        </w:rPr>
+        <w:t xml:space="preserve"> или </w:t>
+      </w:r>
+      <w:r>
+        <w:rPr>
+          <w:rFonts w:ascii="Cascadia Mono" w:hAnsi="Cascadia Mono" w:eastAsia="Cascadia Mono"/>
+          <w:color w:val="17324D"/>
+          <w:sz w:val="18"/>
+          <w:shd w:fill="F3F5F7"/>
+        </w:rPr>
+        <w:t>.bmp</w:t>
+      </w:r>
+      <w:r>
+        <w:rPr>
+          <w:rFonts w:ascii="Aptos" w:hAnsi="Aptos" w:eastAsia="Aptos"/>
+          <w:b w:val="0"/>
+        </w:rPr>
+        <w:t>. Можно выбрать несколько файлов.</w:t>
       </w:r>
     </w:p>
     <w:p>
@@ -1562,13 +1876,8 @@
           <w:rFonts w:ascii="Aptos" w:hAnsi="Aptos" w:eastAsia="Aptos"/>
           <w:b w:val="0"/>
         </w:rPr>
-        <w:t>Следите за двумя разделами в левой панели:</w:t>
-      </w:r>
-    </w:p>
-    <w:p>
-      <w:pPr>
-        <w:pStyle w:val="ListBullet2"/>
-      </w:pPr>
+        <w:t xml:space="preserve">Проверьте список выбранных файлов и при необходимости уберите лишний файл кнопкой рядом с его именем. Кнопка отправки заранее показывает назначение: </w:t>
+      </w:r>
       <w:r>
         <w:rPr>
           <w:rFonts w:ascii="Cascadia Mono" w:hAnsi="Cascadia Mono" w:eastAsia="Cascadia Mono"/>
@@ -1576,20 +1885,15 @@
           <w:sz w:val="18"/>
           <w:shd w:fill="F3F5F7"/>
         </w:rPr>
-        <w:t>Общие документы</w:t>
+        <w:t>Загрузить в чат</w:t>
       </w:r>
       <w:r>
         <w:rPr>
           <w:rFonts w:ascii="Aptos" w:hAnsi="Aptos" w:eastAsia="Aptos"/>
           <w:b w:val="0"/>
         </w:rPr>
-        <w:t xml:space="preserve"> — общий корпус, доступный каждому пользователю;</w:t>
-      </w:r>
-    </w:p>
-    <w:p>
-      <w:pPr>
-        <w:pStyle w:val="ListBullet2"/>
-      </w:pPr>
+        <w:t xml:space="preserve"> или </w:t>
+      </w:r>
       <w:r>
         <w:rPr>
           <w:rFonts w:ascii="Cascadia Mono" w:hAnsi="Cascadia Mono" w:eastAsia="Cascadia Mono"/>
@@ -1597,153 +1901,14 @@
           <w:sz w:val="18"/>
           <w:shd w:fill="F3F5F7"/>
         </w:rPr>
-        <w:t>Документы проекта</w:t>
+        <w:t>Загрузить в проект</w:t>
       </w:r>
       <w:r>
         <w:rPr>
           <w:rFonts w:ascii="Aptos" w:hAnsi="Aptos" w:eastAsia="Aptos"/>
           <w:b w:val="0"/>
         </w:rPr>
-        <w:t xml:space="preserve"> или </w:t>
-      </w:r>
-      <w:r>
-        <w:rPr>
-          <w:rFonts w:ascii="Cascadia Mono" w:hAnsi="Cascadia Mono" w:eastAsia="Cascadia Mono"/>
-          <w:color w:val="17324D"/>
-          <w:sz w:val="18"/>
-          <w:shd w:fill="F3F5F7"/>
-        </w:rPr>
-        <w:t>Документы чата</w:t>
-      </w:r>
-      <w:r>
-        <w:rPr>
-          <w:rFonts w:ascii="Aptos" w:hAnsi="Aptos" w:eastAsia="Aptos"/>
-          <w:b w:val="0"/>
-        </w:rPr>
-        <w:t xml:space="preserve"> — ваши приватные файлы текущей</w:t>
-      </w:r>
-    </w:p>
-    <w:p>
-      <w:r>
-        <w:rPr>
-          <w:rFonts w:ascii="Aptos" w:hAnsi="Aptos" w:eastAsia="Aptos"/>
-          <w:b w:val="0"/>
-        </w:rPr>
-        <w:t>рабочей области.</w:t>
-      </w:r>
-    </w:p>
-    <w:p>
-      <w:r>
-        <w:rPr>
-          <w:rFonts w:ascii="Aptos" w:hAnsi="Aptos" w:eastAsia="Aptos"/>
-          <w:b w:val="0"/>
-        </w:rPr>
-        <w:t>Это основной реестр загруженных файлов; возле каждого заголовка показано их количество. Для каждого файла видны исходное имя, дата загрузки, состояние версии и статус обработки:</w:t>
-      </w:r>
-    </w:p>
-    <w:p>
-      <w:pPr>
-        <w:pStyle w:val="ListBullet2"/>
-      </w:pPr>
-      <w:r>
-        <w:rPr>
-          <w:rFonts w:ascii="Cascadia Mono" w:hAnsi="Cascadia Mono" w:eastAsia="Cascadia Mono"/>
-          <w:color w:val="17324D"/>
-          <w:sz w:val="18"/>
-          <w:shd w:fill="F3F5F7"/>
-        </w:rPr>
-        <w:t>queued</w:t>
-      </w:r>
-      <w:r>
-        <w:rPr>
-          <w:rFonts w:ascii="Aptos" w:hAnsi="Aptos" w:eastAsia="Aptos"/>
-          <w:b w:val="0"/>
-        </w:rPr>
-        <w:t xml:space="preserve"> — задача ожидает worker;</w:t>
-      </w:r>
-    </w:p>
-    <w:p>
-      <w:pPr>
-        <w:pStyle w:val="ListBullet2"/>
-      </w:pPr>
-      <w:r>
-        <w:rPr>
-          <w:rFonts w:ascii="Cascadia Mono" w:hAnsi="Cascadia Mono" w:eastAsia="Cascadia Mono"/>
-          <w:color w:val="17324D"/>
-          <w:sz w:val="18"/>
-          <w:shd w:fill="F3F5F7"/>
-        </w:rPr>
-        <w:t>processing</w:t>
-      </w:r>
-      <w:r>
-        <w:rPr>
-          <w:rFonts w:ascii="Aptos" w:hAnsi="Aptos" w:eastAsia="Aptos"/>
-          <w:b w:val="0"/>
-        </w:rPr>
-        <w:t xml:space="preserve"> — идёт извлечение текста/индексация;</w:t>
-      </w:r>
-    </w:p>
-    <w:p>
-      <w:pPr>
-        <w:pStyle w:val="ListBullet2"/>
-      </w:pPr>
-      <w:r>
-        <w:rPr>
-          <w:rFonts w:ascii="Cascadia Mono" w:hAnsi="Cascadia Mono" w:eastAsia="Cascadia Mono"/>
-          <w:color w:val="17324D"/>
-          <w:sz w:val="18"/>
-          <w:shd w:fill="F3F5F7"/>
-        </w:rPr>
-        <w:t>ready</w:t>
-      </w:r>
-      <w:r>
-        <w:rPr>
-          <w:rFonts w:ascii="Aptos" w:hAnsi="Aptos" w:eastAsia="Aptos"/>
-          <w:b w:val="0"/>
-        </w:rPr>
-        <w:t xml:space="preserve"> — файл доступен retrieval;</w:t>
-      </w:r>
-    </w:p>
-    <w:p>
-      <w:pPr>
-        <w:pStyle w:val="ListBullet2"/>
-      </w:pPr>
-      <w:r>
-        <w:rPr>
-          <w:rFonts w:ascii="Cascadia Mono" w:hAnsi="Cascadia Mono" w:eastAsia="Cascadia Mono"/>
-          <w:color w:val="17324D"/>
-          <w:sz w:val="18"/>
-          <w:shd w:fill="F3F5F7"/>
-        </w:rPr>
-        <w:t>failed</w:t>
-      </w:r>
-      <w:r>
-        <w:rPr>
-          <w:rFonts w:ascii="Aptos" w:hAnsi="Aptos" w:eastAsia="Aptos"/>
-          <w:b w:val="0"/>
-        </w:rPr>
-        <w:t xml:space="preserve"> — индексация завершилась ошибкой;</w:t>
-      </w:r>
-    </w:p>
-    <w:p>
-      <w:pPr>
-        <w:pStyle w:val="ListBullet2"/>
-      </w:pPr>
-      <w:r>
-        <w:rPr>
-          <w:rFonts w:ascii="Cascadia Mono" w:hAnsi="Cascadia Mono" w:eastAsia="Cascadia Mono"/>
-          <w:color w:val="17324D"/>
-          <w:sz w:val="18"/>
-          <w:shd w:fill="F3F5F7"/>
-        </w:rPr>
-        <w:t>cancelled</w:t>
-      </w:r>
-      <w:r>
-        <w:rPr>
-          <w:rFonts w:ascii="Aptos" w:hAnsi="Aptos" w:eastAsia="Aptos"/>
-          <w:b w:val="0"/>
-        </w:rPr>
-        <w:t xml:space="preserve"> — задача отменена.</w:t>
+        <w:t>.</w:t>
       </w:r>
     </w:p>
     <w:p>
@@ -1763,23 +1928,7 @@
           <w:rFonts w:ascii="Aptos" w:hAnsi="Aptos" w:eastAsia="Aptos"/>
           <w:b w:val="0"/>
         </w:rPr>
-        <w:t xml:space="preserve">Для </w:t>
-      </w:r>
-      <w:r>
-        <w:rPr>
-          <w:rFonts w:ascii="Cascadia Mono" w:hAnsi="Cascadia Mono" w:eastAsia="Cascadia Mono"/>
-          <w:color w:val="17324D"/>
-          <w:sz w:val="18"/>
-          <w:shd w:fill="F3F5F7"/>
-        </w:rPr>
-        <w:t>ready</w:t>
-      </w:r>
-      <w:r>
-        <w:rPr>
-          <w:rFonts w:ascii="Aptos" w:hAnsi="Aptos" w:eastAsia="Aptos"/>
-          <w:b w:val="0"/>
-        </w:rPr>
-        <w:t xml:space="preserve"> проверьте ненулевое число чанков. Нулевое значение означает, что текст не извлечён или реестр ещё не обновился.</w:t>
+        <w:t>Нажмите загрузку. API быстро примет файлы и поставит их в очередь. Закрывать страницу не требуется: состояние хранится на сервере и восстановится после обновления браузера.</w:t>
       </w:r>
     </w:p>
     <w:p>
@@ -1799,7 +1948,311 @@
           <w:rFonts w:ascii="Aptos" w:hAnsi="Aptos" w:eastAsia="Aptos"/>
           <w:b w:val="0"/>
         </w:rPr>
+        <w:t>Следите за разделами в левой панели:</w:t>
+      </w:r>
+    </w:p>
+    <w:p>
+      <w:pPr>
+        <w:pStyle w:val="ListBullet2"/>
+      </w:pPr>
+      <w:r>
+        <w:rPr>
+          <w:rFonts w:ascii="Cascadia Mono" w:hAnsi="Cascadia Mono" w:eastAsia="Cascadia Mono"/>
+          <w:color w:val="17324D"/>
+          <w:sz w:val="18"/>
+          <w:shd w:fill="F3F5F7"/>
+        </w:rPr>
+        <w:t>Общие документы</w:t>
+      </w:r>
+      <w:r>
+        <w:rPr>
+          <w:rFonts w:ascii="Aptos" w:hAnsi="Aptos" w:eastAsia="Aptos"/>
+          <w:b w:val="0"/>
+        </w:rPr>
+        <w:t xml:space="preserve"> — общий корпус, доступный каждому пользователю;</w:t>
+      </w:r>
+    </w:p>
+    <w:p>
+      <w:pPr>
+        <w:pStyle w:val="ListBullet2"/>
+      </w:pPr>
+      <w:r>
+        <w:rPr>
+          <w:rFonts w:ascii="Cascadia Mono" w:hAnsi="Cascadia Mono" w:eastAsia="Cascadia Mono"/>
+          <w:color w:val="17324D"/>
+          <w:sz w:val="18"/>
+          <w:shd w:fill="F3F5F7"/>
+        </w:rPr>
+        <w:t>Документы проекта</w:t>
+      </w:r>
+      <w:r>
+        <w:rPr>
+          <w:rFonts w:ascii="Aptos" w:hAnsi="Aptos" w:eastAsia="Aptos"/>
+          <w:b w:val="0"/>
+        </w:rPr>
+        <w:t xml:space="preserve"> — приватные файлы, доступные всем чатам проекта;</w:t>
+      </w:r>
+    </w:p>
+    <w:p>
+      <w:pPr>
+        <w:pStyle w:val="ListBullet2"/>
+      </w:pPr>
+      <w:r>
+        <w:rPr>
+          <w:rFonts w:ascii="Cascadia Mono" w:hAnsi="Cascadia Mono" w:eastAsia="Cascadia Mono"/>
+          <w:color w:val="17324D"/>
+          <w:sz w:val="18"/>
+          <w:shd w:fill="F3F5F7"/>
+        </w:rPr>
+        <w:t>Документы чата</w:t>
+      </w:r>
+      <w:r>
+        <w:rPr>
+          <w:rFonts w:ascii="Aptos" w:hAnsi="Aptos" w:eastAsia="Aptos"/>
+          <w:b w:val="0"/>
+        </w:rPr>
+        <w:t xml:space="preserve"> — приватные файлы только открытой ветки.</w:t>
+      </w:r>
+    </w:p>
+    <w:p>
+      <w:r>
+        <w:rPr>
+          <w:rFonts w:ascii="Aptos" w:hAnsi="Aptos" w:eastAsia="Aptos"/>
+          <w:b w:val="0"/>
+        </w:rPr>
+        <w:t>Это основной реестр загруженных файлов; возле каждого заголовка показано их количество. Для каждого файла видны исходное имя, дата загрузки, состояние версии и статус обработки:</w:t>
+      </w:r>
+    </w:p>
+    <w:p>
+      <w:pPr>
+        <w:pStyle w:val="ListBullet2"/>
+      </w:pPr>
+      <w:r>
+        <w:rPr>
+          <w:rFonts w:ascii="Cascadia Mono" w:hAnsi="Cascadia Mono" w:eastAsia="Cascadia Mono"/>
+          <w:color w:val="17324D"/>
+          <w:sz w:val="18"/>
+          <w:shd w:fill="F3F5F7"/>
+        </w:rPr>
+        <w:t>queued</w:t>
+      </w:r>
+      <w:r>
+        <w:rPr>
+          <w:rFonts w:ascii="Aptos" w:hAnsi="Aptos" w:eastAsia="Aptos"/>
+          <w:b w:val="0"/>
+        </w:rPr>
+        <w:t xml:space="preserve"> — задача ожидает worker;</w:t>
+      </w:r>
+    </w:p>
+    <w:p>
+      <w:pPr>
+        <w:pStyle w:val="ListBullet2"/>
+      </w:pPr>
+      <w:r>
+        <w:rPr>
+          <w:rFonts w:ascii="Cascadia Mono" w:hAnsi="Cascadia Mono" w:eastAsia="Cascadia Mono"/>
+          <w:color w:val="17324D"/>
+          <w:sz w:val="18"/>
+          <w:shd w:fill="F3F5F7"/>
+        </w:rPr>
+        <w:t>processing</w:t>
+      </w:r>
+      <w:r>
+        <w:rPr>
+          <w:rFonts w:ascii="Aptos" w:hAnsi="Aptos" w:eastAsia="Aptos"/>
+          <w:b w:val="0"/>
+        </w:rPr>
+        <w:t xml:space="preserve"> — идёт извлечение текста/индексация;</w:t>
+      </w:r>
+    </w:p>
+    <w:p>
+      <w:pPr>
+        <w:pStyle w:val="ListBullet2"/>
+      </w:pPr>
+      <w:r>
+        <w:rPr>
+          <w:rFonts w:ascii="Cascadia Mono" w:hAnsi="Cascadia Mono" w:eastAsia="Cascadia Mono"/>
+          <w:color w:val="17324D"/>
+          <w:sz w:val="18"/>
+          <w:shd w:fill="F3F5F7"/>
+        </w:rPr>
+        <w:t>ready</w:t>
+      </w:r>
+      <w:r>
+        <w:rPr>
+          <w:rFonts w:ascii="Aptos" w:hAnsi="Aptos" w:eastAsia="Aptos"/>
+          <w:b w:val="0"/>
+        </w:rPr>
+        <w:t xml:space="preserve"> — файл доступен retrieval;</w:t>
+      </w:r>
+    </w:p>
+    <w:p>
+      <w:pPr>
+        <w:pStyle w:val="ListBullet2"/>
+      </w:pPr>
+      <w:r>
+        <w:rPr>
+          <w:rFonts w:ascii="Cascadia Mono" w:hAnsi="Cascadia Mono" w:eastAsia="Cascadia Mono"/>
+          <w:color w:val="17324D"/>
+          <w:sz w:val="18"/>
+          <w:shd w:fill="F3F5F7"/>
+        </w:rPr>
+        <w:t>failed</w:t>
+      </w:r>
+      <w:r>
+        <w:rPr>
+          <w:rFonts w:ascii="Aptos" w:hAnsi="Aptos" w:eastAsia="Aptos"/>
+          <w:b w:val="0"/>
+        </w:rPr>
+        <w:t xml:space="preserve"> — индексация завершилась ошибкой;</w:t>
+      </w:r>
+    </w:p>
+    <w:p>
+      <w:pPr>
+        <w:pStyle w:val="ListBullet2"/>
+      </w:pPr>
+      <w:r>
+        <w:rPr>
+          <w:rFonts w:ascii="Cascadia Mono" w:hAnsi="Cascadia Mono" w:eastAsia="Cascadia Mono"/>
+          <w:color w:val="17324D"/>
+          <w:sz w:val="18"/>
+          <w:shd w:fill="F3F5F7"/>
+        </w:rPr>
+        <w:t>cancelled</w:t>
+      </w:r>
+      <w:r>
+        <w:rPr>
+          <w:rFonts w:ascii="Aptos" w:hAnsi="Aptos" w:eastAsia="Aptos"/>
+          <w:b w:val="0"/>
+        </w:rPr>
+        <w:t xml:space="preserve"> — задача отменена.</w:t>
+      </w:r>
+    </w:p>
+    <w:p>
+      <w:pPr>
+        <w:spacing w:after="60"/>
+        <w:ind w:left="425" w:hanging="272"/>
+      </w:pPr>
+      <w:r>
+        <w:rPr>
+          <w:rFonts w:ascii="Aptos" w:hAnsi="Aptos" w:eastAsia="Aptos"/>
+          <w:color w:val="17324D"/>
+        </w:rPr>
+        <w:t xml:space="preserve">8.  </w:t>
+      </w:r>
+      <w:r>
+        <w:rPr>
+          <w:rFonts w:ascii="Aptos" w:hAnsi="Aptos" w:eastAsia="Aptos"/>
+          <w:b w:val="0"/>
+        </w:rPr>
+        <w:t xml:space="preserve">Для </w:t>
+      </w:r>
+      <w:r>
+        <w:rPr>
+          <w:rFonts w:ascii="Cascadia Mono" w:hAnsi="Cascadia Mono" w:eastAsia="Cascadia Mono"/>
+          <w:color w:val="17324D"/>
+          <w:sz w:val="18"/>
+          <w:shd w:fill="F3F5F7"/>
+        </w:rPr>
+        <w:t>ready</w:t>
+      </w:r>
+      <w:r>
+        <w:rPr>
+          <w:rFonts w:ascii="Aptos" w:hAnsi="Aptos" w:eastAsia="Aptos"/>
+          <w:b w:val="0"/>
+        </w:rPr>
+        <w:t xml:space="preserve"> проверьте ненулевое число чанков. Нулевое значение означает, что текст не извлечён или реестр ещё не обновился.</w:t>
+      </w:r>
+    </w:p>
+    <w:p>
+      <w:pPr>
+        <w:spacing w:after="60"/>
+        <w:ind w:left="425" w:hanging="272"/>
+      </w:pPr>
+      <w:r>
+        <w:rPr>
+          <w:rFonts w:ascii="Aptos" w:hAnsi="Aptos" w:eastAsia="Aptos"/>
+          <w:color w:val="17324D"/>
+        </w:rPr>
+        <w:t xml:space="preserve">9.  </w:t>
+      </w:r>
+      <w:r>
+        <w:rPr>
+          <w:rFonts w:ascii="Aptos" w:hAnsi="Aptos" w:eastAsia="Aptos"/>
+          <w:b w:val="0"/>
+        </w:rPr>
         <w:t>Нажмите имя документа в левой панели, чтобы открыть или скачать именно исходный файл. Техническая панель справа используется для новой загрузки и показывает только краткий счётчик, чтобы не дублировать реестр.</w:t>
+      </w:r>
+    </w:p>
+    <w:p>
+      <w:r>
+        <w:rPr>
+          <w:rFonts w:ascii="Aptos" w:hAnsi="Aptos" w:eastAsia="Aptos"/>
+          <w:b w:val="0"/>
+        </w:rPr>
+        <w:t xml:space="preserve">Тот же выбор области доступен в блоке </w:t>
+      </w:r>
+      <w:r>
+        <w:rPr>
+          <w:rFonts w:ascii="Cascadia Mono" w:hAnsi="Cascadia Mono" w:eastAsia="Cascadia Mono"/>
+          <w:color w:val="17324D"/>
+          <w:sz w:val="18"/>
+          <w:shd w:fill="F3F5F7"/>
+        </w:rPr>
+        <w:t>База знаний</w:t>
+      </w:r>
+      <w:r>
+        <w:rPr>
+          <w:rFonts w:ascii="Aptos" w:hAnsi="Aptos" w:eastAsia="Aptos"/>
+          <w:b w:val="0"/>
+        </w:rPr>
+        <w:t xml:space="preserve"> технической панели. Кнопка </w:t>
+      </w:r>
+      <w:r>
+        <w:rPr>
+          <w:rFonts w:ascii="Cascadia Mono" w:hAnsi="Cascadia Mono" w:eastAsia="Cascadia Mono"/>
+          <w:color w:val="17324D"/>
+          <w:sz w:val="18"/>
+          <w:shd w:fill="F3F5F7"/>
+        </w:rPr>
+        <w:t>+</w:t>
+      </w:r>
+      <w:r>
+        <w:rPr>
+          <w:rFonts w:ascii="Aptos" w:hAnsi="Aptos" w:eastAsia="Aptos"/>
+          <w:b w:val="0"/>
+        </w:rPr>
+        <w:t xml:space="preserve"> рядом с вопросом предназначена для обычной ежедневной работы, а правая панель — для диагностики и расширенных настроек.</w:t>
+      </w:r>
+    </w:p>
+    <w:p>
+      <w:pPr>
+        <w:pStyle w:val="Heading2"/>
+      </w:pPr>
+      <w:r>
+        <w:rPr>
+          <w:rFonts w:ascii="Aptos" w:hAnsi="Aptos" w:eastAsia="Aptos"/>
+          <w:b w:val="0"/>
+        </w:rPr>
+        <w:t>Изображения и OCR</w:t>
+      </w:r>
+    </w:p>
+    <w:p>
+      <w:r>
+        <w:rPr>
+          <w:rFonts w:ascii="Aptos" w:hAnsi="Aptos" w:eastAsia="Aptos"/>
+          <w:b w:val="0"/>
+        </w:rPr>
+        <w:t>Изображения распознаются локально на сервере с помощью OCR на русском и английском языках. После индексации распознанный текст участвует в поиске как текст обычного документа, а источником остаётся исходный файл изображения.</w:t>
+      </w:r>
+    </w:p>
+    <w:p>
+      <w:r>
+        <w:rPr>
+          <w:rFonts w:ascii="Aptos" w:hAnsi="Aptos" w:eastAsia="Aptos"/>
+          <w:b w:val="0"/>
+        </w:rPr>
+        <w:t>OCR хорошо подходит для сканов страниц, фотографий табличек, подписей, печатного текста и снимков экрана. Это не полноценное визуальное рассуждение: система не гарантирует понимание графиков, схем, расположения объектов, почерка и формул сложной вёрстки. Для лучшего результата используйте ровное изображение без бликов, с высоким контрастом и достаточным разрешением. Если формула важна, приложите также текстовую расшифровку или исходный документ.</w:t>
       </w:r>
     </w:p>
     <w:p>
@@ -1868,16 +2321,7 @@
           <w:rFonts w:ascii="Aptos" w:hAnsi="Aptos" w:eastAsia="Aptos"/>
           <w:b w:val="0"/>
         </w:rPr>
-        <w:t xml:space="preserve"> — среди файлов этого проекта версия</w:t>
-      </w:r>
-    </w:p>
-    <w:p>
-      <w:r>
-        <w:rPr>
-          <w:rFonts w:ascii="Aptos" w:hAnsi="Aptos" w:eastAsia="Aptos"/>
-          <w:b w:val="0"/>
-        </w:rPr>
-        <w:t>новее не найдена;</w:t>
+        <w:t xml:space="preserve"> — среди файлов этого проекта версия новее не найдена;</w:t>
       </w:r>
     </w:p>
     <w:p>
@@ -1898,16 +2342,7 @@
           <w:rFonts w:ascii="Aptos" w:hAnsi="Aptos" w:eastAsia="Aptos"/>
           <w:b w:val="0"/>
         </w:rPr>
-        <w:t xml:space="preserve"> — в том же проекте распознана более высокая версия того же</w:t>
-      </w:r>
-    </w:p>
-    <w:p>
-      <w:r>
-        <w:rPr>
-          <w:rFonts w:ascii="Aptos" w:hAnsi="Aptos" w:eastAsia="Aptos"/>
-          <w:b w:val="0"/>
-        </w:rPr>
-        <w:t>семейства документов.</w:t>
+        <w:t xml:space="preserve"> — в том же проекте распознана более высокая версия того же семейства документов.</w:t>
       </w:r>
     </w:p>
     <w:p>
@@ -1993,7 +2428,7 @@
           <w:rFonts w:ascii="Aptos" w:hAnsi="Aptos" w:eastAsia="Aptos"/>
           <w:b w:val="0"/>
         </w:rPr>
-        <w:t>Не превращайте текстовые страницы в картинки без OCR.</w:t>
+        <w:t>Если загружаете скан, проверьте резкость, ориентацию страницы и контраст.</w:t>
       </w:r>
     </w:p>
     <w:p>
@@ -2757,16 +3192,7 @@
           <w:rFonts w:ascii="Aptos" w:hAnsi="Aptos" w:eastAsia="Aptos"/>
           <w:b w:val="0"/>
         </w:rPr>
-        <w:t>Если нормативный документ задаёт расчёт словами, система может вывести</w:t>
-      </w:r>
-    </w:p>
-    <w:p>
-      <w:r>
-        <w:rPr>
-          <w:rFonts w:ascii="Aptos" w:hAnsi="Aptos" w:eastAsia="Aptos"/>
-          <w:b w:val="0"/>
-        </w:rPr>
-        <w:t>проверенное равенство — например, представить ИВ0 как разность объёма по УДГ и объёма по плановому ДГ, — но только когда обе величины однозначно названы в найденном правиле. Ни одна неизвестная переменная или числовое значение не достраивается автоматически.</w:t>
+        <w:t>Если нормативный документ задаёт расчёт словами, система может вывести проверенное равенство — например, представить ИВ0 как разность объёма по УДГ и объёма по плановому ДГ, — но только когда обе величины однозначно названы в найденном правиле. Ни одна неизвестная переменная или числовое значение не достраивается автоматически.</w:t>
       </w:r>
     </w:p>
     <w:p>
@@ -2790,16 +3216,7 @@
           <w:rFonts w:ascii="Aptos" w:hAnsi="Aptos" w:eastAsia="Aptos"/>
           <w:b w:val="0"/>
         </w:rPr>
-        <w:t>Не копируйте визуально отрисованную формулу как изображение, если нужна</w:t>
-      </w:r>
-    </w:p>
-    <w:p>
-      <w:r>
-        <w:rPr>
-          <w:rFonts w:ascii="Aptos" w:hAnsi="Aptos" w:eastAsia="Aptos"/>
-          <w:b w:val="0"/>
-        </w:rPr>
-        <w:t>машинная обработка: используйте исходный текст ответа.</w:t>
+        <w:t>Не копируйте визуально отрисованную формулу как изображение, если нужна машинная обработка: используйте исходный текст ответа.</w:t>
       </w:r>
     </w:p>
     <w:p>
@@ -3442,16 +3859,7 @@
           <w:rFonts w:ascii="Aptos" w:hAnsi="Aptos" w:eastAsia="Aptos"/>
           <w:b w:val="0"/>
         </w:rPr>
-        <w:t>Считайте общий документ доступным каждому зарегистрированному пользователю</w:t>
-      </w:r>
-    </w:p>
-    <w:p>
-      <w:r>
-        <w:rPr>
-          <w:rFonts w:ascii="Aptos" w:hAnsi="Aptos" w:eastAsia="Aptos"/>
-          <w:b w:val="0"/>
-        </w:rPr>
-        <w:t>среды. Конфиденциальные материалы загружайте только в свой проект.</w:t>
+        <w:t>Считайте общий документ доступным каждому зарегистрированному пользователю среды. Конфиденциальные материалы загружайте только в свой проект.</w:t>
       </w:r>
     </w:p>
     <w:p>
@@ -3499,16 +3907,7 @@
           <w:rFonts w:ascii="Aptos" w:hAnsi="Aptos" w:eastAsia="Aptos"/>
           <w:b w:val="0"/>
         </w:rPr>
-        <w:t>Не воспринимайте инструкции внутри документа как команды системе: подозрительные</w:t>
-      </w:r>
-    </w:p>
-    <w:p>
-      <w:r>
-        <w:rPr>
-          <w:rFonts w:ascii="Aptos" w:hAnsi="Aptos" w:eastAsia="Aptos"/>
-          <w:b w:val="0"/>
-        </w:rPr>
-        <w:t>prompt-injection фрагменты фильтруются, но документ остаётся недоверенным вводом.</w:t>
+        <w:t>Не воспринимайте инструкции внутри документа как команды системе: подозрительные prompt-injection фрагменты фильтруются, но документ остаётся недоверенным вводом.</w:t>
       </w:r>
     </w:p>
     <w:p>
@@ -3520,16 +3919,7 @@
           <w:rFonts w:ascii="Aptos" w:hAnsi="Aptos" w:eastAsia="Aptos"/>
           <w:b w:val="0"/>
         </w:rPr>
-        <w:t>Для юридических, финансовых, медицинских и производственно-безопасностных</w:t>
-      </w:r>
-    </w:p>
-    <w:p>
-      <w:r>
-        <w:rPr>
-          <w:rFonts w:ascii="Aptos" w:hAnsi="Aptos" w:eastAsia="Aptos"/>
-          <w:b w:val="0"/>
-        </w:rPr>
-        <w:t>решений обязательно привлекайте уполномоченного специалиста.</w:t>
+        <w:t>Для юридических, финансовых, медицинских и производственно-безопасностных решений обязательно привлекайте уполномоченного специалиста.</w:t>
       </w:r>
     </w:p>
     <w:p>

</xml_diff>

<commit_message>
feat: complete document deletion lifecycle
</commit_message>
<xml_diff>
--- a/docs/Руководство_пользователя_RAG_Assistant.docx
+++ b/docs/Руководство_пользователя_RAG_Assistant.docx
@@ -2182,6 +2182,35 @@
           <w:b w:val="0"/>
         </w:rPr>
         <w:t>Нажмите имя документа в левой панели, чтобы открыть или скачать именно исходный файл. Техническая панель справа используется для новой загрузки и показывает только краткий счётчик, чтобы не дублировать реестр.</w:t>
+      </w:r>
+    </w:p>
+    <w:p>
+      <w:pPr>
+        <w:spacing w:after="60"/>
+        <w:ind w:left="425" w:hanging="272"/>
+      </w:pPr>
+      <w:r>
+        <w:rPr>
+          <w:rFonts w:ascii="Aptos" w:hAnsi="Aptos" w:eastAsia="Aptos"/>
+          <w:color w:val="17324D"/>
+        </w:rPr>
+        <w:t xml:space="preserve">10.  </w:t>
+      </w:r>
+      <w:r>
+        <w:rPr>
+          <w:rFonts w:ascii="Aptos" w:hAnsi="Aptos" w:eastAsia="Aptos"/>
+          <w:b w:val="0"/>
+        </w:rPr>
+        <w:t>Чтобы удалить приватный документ, нажмите кнопку с корзиной справа от его строки и подтвердите действие. Документ сразу исчезает из доступной области и перестаёт участвовать в новых ответах; удаление чанков из Qdrant и BM25 и исходного файла выполняется через ту же последовательную очередь, что и индексация. Действие необратимо. Общий документ может удалить только администратор, потому что это влияет на всех пользователей.</w:t>
+      </w:r>
+    </w:p>
+    <w:p>
+      <w:r>
+        <w:rPr>
+          <w:rFonts w:ascii="Aptos" w:hAnsi="Aptos" w:eastAsia="Aptos"/>
+          <w:b w:val="0"/>
+        </w:rPr>
+        <w:t>Если после подтверждения показано сообщение, что документ скрыт, но очередь очистки недоступна, не загружайте тот же файл повторно. Он уже исключён из поиска, однако администратору нужно повторить физическую очистку по job ID.</w:t>
       </w:r>
     </w:p>
     <w:p>
@@ -4668,6 +4697,60 @@
                 <w:rFonts w:ascii="Aptos" w:hAnsi="Aptos" w:eastAsia="Aptos"/>
                 <w:b w:val="0"/>
               </w:rPr>
+              <w:t>Документ удалён, но показана ошибка очереди очистки</w:t>
+            </w:r>
+          </w:p>
+        </w:tc>
+        <w:tc>
+          <w:tcPr>
+            <w:tcW w:type="dxa" w:w="4929"/>
+            <w:shd w:fill="F3F5F7"/>
+            <w:tcMar>
+              <w:top w:w="90" w:type="dxa"/>
+              <w:start w:w="120" w:type="dxa"/>
+              <w:bottom w:w="90" w:type="dxa"/>
+              <w:end w:w="120" w:type="dxa"/>
+            </w:tcMar>
+            <w:vAlign w:val="top"/>
+          </w:tcPr>
+          <w:p>
+            <w:pPr>
+              <w:spacing w:after="0"/>
+            </w:pPr>
+            <w:r>
+              <w:rPr>
+                <w:rFonts w:ascii="Aptos" w:hAnsi="Aptos" w:eastAsia="Aptos"/>
+                <w:b w:val="0"/>
+              </w:rPr>
+              <w:t>не загружать дубль; передать администратору имя документа, время и job ID — документ уже исключён из новых ответов</w:t>
+            </w:r>
+          </w:p>
+        </w:tc>
+      </w:tr>
+      <w:tr>
+        <w:trPr>
+          <w:cantSplit w:val="true"/>
+        </w:trPr>
+        <w:tc>
+          <w:tcPr>
+            <w:tcW w:type="dxa" w:w="4929"/>
+            <w:tcMar>
+              <w:top w:w="90" w:type="dxa"/>
+              <w:start w:w="120" w:type="dxa"/>
+              <w:bottom w:w="90" w:type="dxa"/>
+              <w:end w:w="120" w:type="dxa"/>
+            </w:tcMar>
+            <w:vAlign w:val="top"/>
+          </w:tcPr>
+          <w:p>
+            <w:pPr>
+              <w:spacing w:after="0"/>
+            </w:pPr>
+            <w:r>
+              <w:rPr>
+                <w:rFonts w:ascii="Aptos" w:hAnsi="Aptos" w:eastAsia="Aptos"/>
+                <w:b w:val="0"/>
+              </w:rPr>
               <w:t xml:space="preserve">Ответ остался </w:t>
             </w:r>
             <w:r>
@@ -4684,7 +4767,6 @@
         <w:tc>
           <w:tcPr>
             <w:tcW w:type="dxa" w:w="4929"/>
-            <w:shd w:fill="F3F5F7"/>
             <w:tcMar>
               <w:top w:w="90" w:type="dxa"/>
               <w:start w:w="120" w:type="dxa"/>
@@ -4714,6 +4796,7 @@
         <w:tc>
           <w:tcPr>
             <w:tcW w:type="dxa" w:w="4929"/>
+            <w:shd w:fill="F3F5F7"/>
             <w:tcMar>
               <w:top w:w="90" w:type="dxa"/>
               <w:start w:w="120" w:type="dxa"/>
@@ -4738,6 +4821,7 @@
         <w:tc>
           <w:tcPr>
             <w:tcW w:type="dxa" w:w="4929"/>
+            <w:shd w:fill="F3F5F7"/>
             <w:tcMar>
               <w:top w:w="90" w:type="dxa"/>
               <w:start w:w="120" w:type="dxa"/>
@@ -4767,7 +4851,6 @@
         <w:tc>
           <w:tcPr>
             <w:tcW w:type="dxa" w:w="4929"/>
-            <w:shd w:fill="F3F5F7"/>
             <w:tcMar>
               <w:top w:w="90" w:type="dxa"/>
               <w:start w:w="120" w:type="dxa"/>
@@ -4792,7 +4875,6 @@
         <w:tc>
           <w:tcPr>
             <w:tcW w:type="dxa" w:w="4929"/>
-            <w:shd w:fill="F3F5F7"/>
             <w:tcMar>
               <w:top w:w="90" w:type="dxa"/>
               <w:start w:w="120" w:type="dxa"/>
@@ -4822,6 +4904,7 @@
         <w:tc>
           <w:tcPr>
             <w:tcW w:type="dxa" w:w="4929"/>
+            <w:shd w:fill="F3F5F7"/>
             <w:tcMar>
               <w:top w:w="90" w:type="dxa"/>
               <w:start w:w="120" w:type="dxa"/>
@@ -4846,6 +4929,7 @@
         <w:tc>
           <w:tcPr>
             <w:tcW w:type="dxa" w:w="4929"/>
+            <w:shd w:fill="F3F5F7"/>
             <w:tcMar>
               <w:top w:w="90" w:type="dxa"/>
               <w:start w:w="120" w:type="dxa"/>
@@ -4907,7 +4991,6 @@
         <w:tc>
           <w:tcPr>
             <w:tcW w:type="dxa" w:w="4929"/>
-            <w:shd w:fill="F3F5F7"/>
             <w:tcMar>
               <w:top w:w="90" w:type="dxa"/>
               <w:start w:w="120" w:type="dxa"/>
@@ -4932,7 +5015,6 @@
         <w:tc>
           <w:tcPr>
             <w:tcW w:type="dxa" w:w="4929"/>
-            <w:shd w:fill="F3F5F7"/>
             <w:tcMar>
               <w:top w:w="90" w:type="dxa"/>
               <w:start w:w="120" w:type="dxa"/>
@@ -5102,7 +5184,6 @@
     <w:p>
       <w:pPr>
         <w:pStyle w:val="Heading1"/>
-        <w:pageBreakBefore/>
       </w:pPr>
       <w:r>
         <w:rPr>

</xml_diff>

<commit_message>
Document production RAG behavior and acceptance
</commit_message>
<xml_diff>
--- a/docs/Руководство_пользователя_RAG_Assistant.docx
+++ b/docs/Руководство_пользователя_RAG_Assistant.docx
@@ -2539,6 +2539,161 @@
           <w:b w:val="0"/>
         </w:rPr>
         <w:t>Хороший вопрос задаёт объект, действие, период/редакцию и желаемую форму ответа.</w:t>
+      </w:r>
+    </w:p>
+    <w:p>
+      <w:r>
+        <w:rPr>
+          <w:rFonts w:ascii="Aptos" w:hAnsi="Aptos" w:eastAsia="Aptos"/>
+          <w:b w:val="0"/>
+        </w:rPr>
+        <w:t xml:space="preserve">Перед поиском система отдельно определяет смысл запроса: сохраняет обозначения вроде </w:t>
+      </w:r>
+      <w:r>
+        <w:rPr>
+          <w:rFonts w:ascii="Cascadia Mono" w:hAnsi="Cascadia Mono" w:eastAsia="Cascadia Mono"/>
+          <w:color w:val="17324D"/>
+          <w:sz w:val="18"/>
+          <w:shd w:fill="F3F5F7"/>
+        </w:rPr>
+        <w:t>1 ЦК</w:t>
+      </w:r>
+      <w:r>
+        <w:rPr>
+          <w:rFonts w:ascii="Aptos" w:hAnsi="Aptos" w:eastAsia="Aptos"/>
+          <w:b w:val="0"/>
+        </w:rPr>
+        <w:t xml:space="preserve">, </w:t>
+      </w:r>
+      <w:r>
+        <w:rPr>
+          <w:rFonts w:ascii="Cascadia Mono" w:hAnsi="Cascadia Mono" w:eastAsia="Cascadia Mono"/>
+          <w:color w:val="17324D"/>
+          <w:sz w:val="18"/>
+          <w:shd w:fill="F3F5F7"/>
+        </w:rPr>
+        <w:t>6ЦК</w:t>
+      </w:r>
+      <w:r>
+        <w:rPr>
+          <w:rFonts w:ascii="Aptos" w:hAnsi="Aptos" w:eastAsia="Aptos"/>
+          <w:b w:val="0"/>
+        </w:rPr>
+        <w:t xml:space="preserve">, номера пунктов и названия сущностей, исправляет очевидные опечатки в обычных словах и раскладывает составной вопрос на части. Поэтому запрос </w:t>
+      </w:r>
+      <w:r>
+        <w:rPr>
+          <w:rFonts w:ascii="Cascadia Mono" w:hAnsi="Cascadia Mono" w:eastAsia="Cascadia Mono"/>
+          <w:color w:val="17324D"/>
+          <w:sz w:val="18"/>
+          <w:shd w:fill="F3F5F7"/>
+        </w:rPr>
+        <w:t>что такое 6ЦК и ак она рассчитывается</w:t>
+      </w:r>
+      <w:r>
+        <w:rPr>
+          <w:rFonts w:ascii="Aptos" w:hAnsi="Aptos" w:eastAsia="Aptos"/>
+          <w:b w:val="0"/>
+        </w:rPr>
+        <w:t xml:space="preserve"> должен быть понят как просьба дать определение и порядок расчёта 6 ЦК, а не как буквальный поиск слова </w:t>
+      </w:r>
+      <w:r>
+        <w:rPr>
+          <w:rFonts w:ascii="Cascadia Mono" w:hAnsi="Cascadia Mono" w:eastAsia="Cascadia Mono"/>
+          <w:color w:val="17324D"/>
+          <w:sz w:val="18"/>
+          <w:shd w:fill="F3F5F7"/>
+        </w:rPr>
+        <w:t>ак</w:t>
+      </w:r>
+      <w:r>
+        <w:rPr>
+          <w:rFonts w:ascii="Aptos" w:hAnsi="Aptos" w:eastAsia="Aptos"/>
+          <w:b w:val="0"/>
+        </w:rPr>
+        <w:t>. Если опечатка меняет специальный термин или номер пункта, система не угадывает молча: уточните обозначение в следующем сообщении.</w:t>
+      </w:r>
+    </w:p>
+    <w:p>
+      <w:r>
+        <w:rPr>
+          <w:rFonts w:ascii="Aptos" w:hAnsi="Aptos" w:eastAsia="Aptos"/>
+          <w:b w:val="0"/>
+        </w:rPr>
+        <w:t xml:space="preserve">Для вопросов о расчёте retrieval ищет отдельно определение, условия применения, формулы, параметры и связанные составляющие в нескольких документах. Ответ должен объединять только согласующиеся фрагменты и ставить источник возле того утверждения, которое он подтверждает. Откройте </w:t>
+      </w:r>
+      <w:r>
+        <w:rPr>
+          <w:rFonts w:ascii="Cascadia Mono" w:hAnsi="Cascadia Mono" w:eastAsia="Cascadia Mono"/>
+          <w:color w:val="17324D"/>
+          <w:sz w:val="18"/>
+          <w:shd w:fill="F3F5F7"/>
+        </w:rPr>
+        <w:t>Sources</w:t>
+      </w:r>
+      <w:r>
+        <w:rPr>
+          <w:rFonts w:ascii="Aptos" w:hAnsi="Aptos" w:eastAsia="Aptos"/>
+          <w:b w:val="0"/>
+        </w:rPr>
+        <w:t xml:space="preserve">: там должны быть все документы, реально использованные в тексте ответа. </w:t>
+      </w:r>
+      <w:r>
+        <w:rPr>
+          <w:rFonts w:ascii="Cascadia Mono" w:hAnsi="Cascadia Mono" w:eastAsia="Cascadia Mono"/>
+          <w:color w:val="17324D"/>
+          <w:sz w:val="18"/>
+          <w:shd w:fill="F3F5F7"/>
+        </w:rPr>
+        <w:t>Debug</w:t>
+      </w:r>
+      <w:r>
+        <w:rPr>
+          <w:rFonts w:ascii="Aptos" w:hAnsi="Aptos" w:eastAsia="Aptos"/>
+          <w:b w:val="0"/>
+        </w:rPr>
+        <w:t xml:space="preserve"> может показывать больше найденных кандидатов, но они не считаются использованными источниками, пока на них нет ссылки в ответе.</w:t>
+      </w:r>
+    </w:p>
+    <w:p>
+      <w:r>
+        <w:rPr>
+          <w:rFonts w:ascii="Aptos" w:hAnsi="Aptos" w:eastAsia="Aptos"/>
+          <w:b w:val="0"/>
+        </w:rPr>
+        <w:t xml:space="preserve">Вопросы вида </w:t>
+      </w:r>
+      <w:r>
+        <w:rPr>
+          <w:rFonts w:ascii="Cascadia Mono" w:hAnsi="Cascadia Mono" w:eastAsia="Cascadia Mono"/>
+          <w:color w:val="17324D"/>
+          <w:sz w:val="18"/>
+          <w:shd w:fill="F3F5F7"/>
+        </w:rPr>
+        <w:t>В каких документах фигурирует 1 ЦК?</w:t>
+      </w:r>
+      <w:r>
+        <w:rPr>
+          <w:rFonts w:ascii="Aptos" w:hAnsi="Aptos" w:eastAsia="Aptos"/>
+          <w:b w:val="0"/>
+        </w:rPr>
+        <w:t xml:space="preserve"> работают как положительный список. Система перечисляет только документы с подтверждённым прямым упоминанием искомой категории. Она не должна добавлять документы, где термина нет, и объяснять их отсутствие. Название семейства вроде </w:t>
+      </w:r>
+      <w:r>
+        <w:rPr>
+          <w:rFonts w:ascii="Cascadia Mono" w:hAnsi="Cascadia Mono" w:eastAsia="Cascadia Mono"/>
+          <w:color w:val="17324D"/>
+          <w:sz w:val="18"/>
+          <w:shd w:fill="F3F5F7"/>
+        </w:rPr>
+        <w:t>1-6 ЦК</w:t>
+      </w:r>
+      <w:r>
+        <w:rPr>
+          <w:rFonts w:ascii="Aptos" w:hAnsi="Aptos" w:eastAsia="Aptos"/>
+          <w:b w:val="0"/>
+        </w:rPr>
+        <w:t xml:space="preserve"> само по себе не считается доказательством: в выбранном разделе должно быть прямое упоминание нужной категории.</w:t>
       </w:r>
     </w:p>
     <w:p>

</xml_diff>

<commit_message>
Separate global project and chat uploads
</commit_message>
<xml_diff>
--- a/docs/Руководство_пользователя_RAG_Assistant.docx
+++ b/docs/Руководство_пользователя_RAG_Assistant.docx
@@ -1109,7 +1109,39 @@
           <w:rFonts w:ascii="Aptos" w:hAnsi="Aptos" w:eastAsia="Aptos"/>
           <w:b w:val="0"/>
         </w:rPr>
-        <w:t>Каждый проект и его чаты принадлежат создавшему их пользователю и не видны другим обычным пользователям. В технической панели выберите область знаний:</w:t>
+        <w:t xml:space="preserve">Каждый проект и его чаты принадлежат создавшему их пользователю и не видны другим обычным пользователям. Наведите указатель на проект в левой панели, выберите </w:t>
+      </w:r>
+      <w:r>
+        <w:rPr>
+          <w:rFonts w:ascii="Cascadia Mono" w:hAnsi="Cascadia Mono" w:eastAsia="Cascadia Mono"/>
+          <w:color w:val="17324D"/>
+          <w:sz w:val="18"/>
+          <w:shd w:fill="F3F5F7"/>
+        </w:rPr>
+        <w:t>Память и документы</w:t>
+      </w:r>
+      <w:r>
+        <w:rPr>
+          <w:rFonts w:ascii="Aptos" w:hAnsi="Aptos" w:eastAsia="Aptos"/>
+          <w:b w:val="0"/>
+        </w:rPr>
+        <w:t xml:space="preserve">, затем настройте поле </w:t>
+      </w:r>
+      <w:r>
+        <w:rPr>
+          <w:rFonts w:ascii="Cascadia Mono" w:hAnsi="Cascadia Mono" w:eastAsia="Cascadia Mono"/>
+          <w:color w:val="17324D"/>
+          <w:sz w:val="18"/>
+          <w:shd w:fill="F3F5F7"/>
+        </w:rPr>
+        <w:t>Использовать</w:t>
+      </w:r>
+      <w:r>
+        <w:rPr>
+          <w:rFonts w:ascii="Aptos" w:hAnsi="Aptos" w:eastAsia="Aptos"/>
+          <w:b w:val="0"/>
+        </w:rPr>
+        <w:t>:</w:t>
       </w:r>
     </w:p>
     <w:p>
@@ -1441,7 +1473,55 @@
           <w:rFonts w:ascii="Aptos" w:hAnsi="Aptos" w:eastAsia="Aptos"/>
           <w:b w:val="0"/>
         </w:rPr>
-        <w:t>Изменение памяти влияет на следующие ответы и входит в область ключа кэша.</w:t>
+        <w:t xml:space="preserve">Чтобы открыть память, наведите указатель на проект в левой панели и выберите </w:t>
+      </w:r>
+      <w:r>
+        <w:rPr>
+          <w:rFonts w:ascii="Cascadia Mono" w:hAnsi="Cascadia Mono" w:eastAsia="Cascadia Mono"/>
+          <w:color w:val="17324D"/>
+          <w:sz w:val="18"/>
+          <w:shd w:fill="F3F5F7"/>
+        </w:rPr>
+        <w:t>Память и документы</w:t>
+      </w:r>
+      <w:r>
+        <w:rPr>
+          <w:rFonts w:ascii="Aptos" w:hAnsi="Aptos" w:eastAsia="Aptos"/>
+          <w:b w:val="0"/>
+        </w:rPr>
+        <w:t xml:space="preserve">. Измените поле </w:t>
+      </w:r>
+      <w:r>
+        <w:rPr>
+          <w:rFonts w:ascii="Cascadia Mono" w:hAnsi="Cascadia Mono" w:eastAsia="Cascadia Mono"/>
+          <w:color w:val="17324D"/>
+          <w:sz w:val="18"/>
+          <w:shd w:fill="F3F5F7"/>
+        </w:rPr>
+        <w:t>Контекст проекта</w:t>
+      </w:r>
+      <w:r>
+        <w:rPr>
+          <w:rFonts w:ascii="Aptos" w:hAnsi="Aptos" w:eastAsia="Aptos"/>
+          <w:b w:val="0"/>
+        </w:rPr>
+        <w:t xml:space="preserve"> и нажмите </w:t>
+      </w:r>
+      <w:r>
+        <w:rPr>
+          <w:rFonts w:ascii="Cascadia Mono" w:hAnsi="Cascadia Mono" w:eastAsia="Cascadia Mono"/>
+          <w:color w:val="17324D"/>
+          <w:sz w:val="18"/>
+          <w:shd w:fill="F3F5F7"/>
+        </w:rPr>
+        <w:t>Сохранить память</w:t>
+      </w:r>
+      <w:r>
+        <w:rPr>
+          <w:rFonts w:ascii="Aptos" w:hAnsi="Aptos" w:eastAsia="Aptos"/>
+          <w:b w:val="0"/>
+        </w:rPr>
+        <w:t>. В этой же панели настраивается область источников и показан полный реестр документов проекта. Изменение памяти влияет на следующие ответы и входит в область ключа кэша.</w:t>
       </w:r>
     </w:p>
     <w:p>
@@ -1454,6 +1534,27 @@
           <w:b w:val="0"/>
         </w:rPr>
         <w:t>6. Загрузка документов</w:t>
+      </w:r>
+    </w:p>
+    <w:p>
+      <w:r>
+        <w:rPr>
+          <w:rFonts w:ascii="Aptos" w:hAnsi="Aptos" w:eastAsia="Aptos"/>
+          <w:b w:val="0"/>
+        </w:rPr>
+        <w:t>Место загрузки однозначно определяет область файла. Один и тот же выбор файлов не переносится между формами.</w:t>
+      </w:r>
+    </w:p>
+    <w:p>
+      <w:pPr>
+        <w:pStyle w:val="Heading2"/>
+      </w:pPr>
+      <w:r>
+        <w:rPr>
+          <w:rFonts w:ascii="Aptos" w:hAnsi="Aptos" w:eastAsia="Aptos"/>
+          <w:b w:val="0"/>
+        </w:rPr>
+        <w:t>Только текущий чат</w:t>
       </w:r>
     </w:p>
     <w:p>
@@ -1473,7 +1574,39 @@
           <w:rFonts w:ascii="Aptos" w:hAnsi="Aptos" w:eastAsia="Aptos"/>
           <w:b w:val="0"/>
         </w:rPr>
-        <w:t>Откройте нужный проект или свободный чат.</w:t>
+        <w:t xml:space="preserve">Откройте нужный чат и нажмите </w:t>
+      </w:r>
+      <w:r>
+        <w:rPr>
+          <w:rFonts w:ascii="Cascadia Mono" w:hAnsi="Cascadia Mono" w:eastAsia="Cascadia Mono"/>
+          <w:color w:val="17324D"/>
+          <w:sz w:val="18"/>
+          <w:shd w:fill="F3F5F7"/>
+        </w:rPr>
+        <w:t>+</w:t>
+      </w:r>
+      <w:r>
+        <w:rPr>
+          <w:rFonts w:ascii="Aptos" w:hAnsi="Aptos" w:eastAsia="Aptos"/>
+          <w:b w:val="0"/>
+        </w:rPr>
+        <w:t xml:space="preserve"> слева от поля </w:t>
+      </w:r>
+      <w:r>
+        <w:rPr>
+          <w:rFonts w:ascii="Cascadia Mono" w:hAnsi="Cascadia Mono" w:eastAsia="Cascadia Mono"/>
+          <w:color w:val="17324D"/>
+          <w:sz w:val="18"/>
+          <w:shd w:fill="F3F5F7"/>
+        </w:rPr>
+        <w:t>Введите вопрос</w:t>
+      </w:r>
+      <w:r>
+        <w:rPr>
+          <w:rFonts w:ascii="Aptos" w:hAnsi="Aptos" w:eastAsia="Aptos"/>
+          <w:b w:val="0"/>
+        </w:rPr>
+        <w:t>.</w:t>
       </w:r>
     </w:p>
     <w:p>
@@ -1493,7 +1626,7 @@
           <w:rFonts w:ascii="Aptos" w:hAnsi="Aptos" w:eastAsia="Aptos"/>
           <w:b w:val="0"/>
         </w:rPr>
-        <w:t xml:space="preserve">Нажмите кнопку </w:t>
+        <w:t xml:space="preserve">В панели </w:t>
       </w:r>
       <w:r>
         <w:rPr>
@@ -1502,14 +1635,14 @@
           <w:sz w:val="18"/>
           <w:shd w:fill="F3F5F7"/>
         </w:rPr>
-        <w:t>+</w:t>
+        <w:t>Добавить в текущий чат</w:t>
       </w:r>
       <w:r>
         <w:rPr>
           <w:rFonts w:ascii="Aptos" w:hAnsi="Aptos" w:eastAsia="Aptos"/>
           <w:b w:val="0"/>
         </w:rPr>
-        <w:t xml:space="preserve"> слева от поля </w:t>
+        <w:t xml:space="preserve"> выберите </w:t>
       </w:r>
       <w:r>
         <w:rPr>
@@ -1518,14 +1651,14 @@
           <w:sz w:val="18"/>
           <w:shd w:fill="F3F5F7"/>
         </w:rPr>
-        <w:t>Введите вопрос</w:t>
+        <w:t>Документ</w:t>
       </w:r>
       <w:r>
         <w:rPr>
           <w:rFonts w:ascii="Aptos" w:hAnsi="Aptos" w:eastAsia="Aptos"/>
           <w:b w:val="0"/>
         </w:rPr>
-        <w:t xml:space="preserve">. Откроется панель </w:t>
+        <w:t xml:space="preserve"> или </w:t>
       </w:r>
       <w:r>
         <w:rPr>
@@ -1534,7 +1667,7 @@
           <w:sz w:val="18"/>
           <w:shd w:fill="F3F5F7"/>
         </w:rPr>
-        <w:t>Добавить в контекст</w:t>
+        <w:t>Изображение</w:t>
       </w:r>
       <w:r>
         <w:rPr>
@@ -1561,13 +1694,8 @@
           <w:rFonts w:ascii="Aptos" w:hAnsi="Aptos" w:eastAsia="Aptos"/>
           <w:b w:val="0"/>
         </w:rPr>
-        <w:t>Выберите область использования:</w:t>
-      </w:r>
-    </w:p>
-    <w:p>
-      <w:pPr>
-        <w:pStyle w:val="ListBullet2"/>
-      </w:pPr>
+        <w:t xml:space="preserve">Проверьте список файлов и нажмите </w:t>
+      </w:r>
       <w:r>
         <w:rPr>
           <w:rFonts w:ascii="Cascadia Mono" w:hAnsi="Cascadia Mono" w:eastAsia="Cascadia Mono"/>
@@ -1575,60 +1703,35 @@
           <w:sz w:val="18"/>
           <w:shd w:fill="F3F5F7"/>
         </w:rPr>
-        <w:t>Только в этом чате</w:t>
+        <w:t>Загрузить в чат</w:t>
       </w:r>
       <w:r>
         <w:rPr>
           <w:rFonts w:ascii="Aptos" w:hAnsi="Aptos" w:eastAsia="Aptos"/>
           <w:b w:val="0"/>
         </w:rPr>
-        <w:t xml:space="preserve"> — файл будет доступен только в открытой ветке;</w:t>
+        <w:t>.</w:t>
+      </w:r>
+    </w:p>
+    <w:p>
+      <w:r>
+        <w:rPr>
+          <w:rFonts w:ascii="Aptos" w:hAnsi="Aptos" w:eastAsia="Aptos"/>
+          <w:b w:val="0"/>
+        </w:rPr>
+        <w:t>Файл будет доступен только в открытом чате. Из формы у вопроса нельзя загрузить файл в проект или в общую базу.</w:t>
       </w:r>
     </w:p>
     <w:p>
       <w:pPr>
-        <w:pStyle w:val="ListBullet2"/>
+        <w:pStyle w:val="Heading2"/>
       </w:pPr>
-      <w:r>
-        <w:rPr>
-          <w:rFonts w:ascii="Cascadia Mono" w:hAnsi="Cascadia Mono" w:eastAsia="Cascadia Mono"/>
-          <w:color w:val="17324D"/>
-          <w:sz w:val="18"/>
-          <w:shd w:fill="F3F5F7"/>
-        </w:rPr>
-        <w:t>Во всём проекте</w:t>
-      </w:r>
       <w:r>
         <w:rPr>
           <w:rFonts w:ascii="Aptos" w:hAnsi="Aptos" w:eastAsia="Aptos"/>
           <w:b w:val="0"/>
         </w:rPr>
-        <w:t xml:space="preserve"> — файл смогут использовать все чаты текущего проекта.</w:t>
-      </w:r>
-    </w:p>
-    <w:p>
-      <w:r>
-        <w:rPr>
-          <w:rFonts w:ascii="Aptos" w:hAnsi="Aptos" w:eastAsia="Aptos"/>
-          <w:b w:val="0"/>
-        </w:rPr>
-        <w:t xml:space="preserve">Файл в обоих случаях остаётся приватным для владельца проекта. В свободном чате доступен только вариант </w:t>
-      </w:r>
-      <w:r>
-        <w:rPr>
-          <w:rFonts w:ascii="Cascadia Mono" w:hAnsi="Cascadia Mono" w:eastAsia="Cascadia Mono"/>
-          <w:color w:val="17324D"/>
-          <w:sz w:val="18"/>
-          <w:shd w:fill="F3F5F7"/>
-        </w:rPr>
-        <w:t>Только в этом чате</w:t>
-      </w:r>
-      <w:r>
-        <w:rPr>
-          <w:rFonts w:ascii="Aptos" w:hAnsi="Aptos" w:eastAsia="Aptos"/>
-          <w:b w:val="0"/>
-        </w:rPr>
-        <w:t>.</w:t>
+        <w:t>Все чаты проекта</w:t>
       </w:r>
     </w:p>
     <w:p>
@@ -1641,222 +1744,14 @@
           <w:rFonts w:ascii="Aptos" w:hAnsi="Aptos" w:eastAsia="Aptos"/>
           <w:color w:val="17324D"/>
         </w:rPr>
-        <w:t xml:space="preserve">4.  </w:t>
+        <w:t xml:space="preserve">1.  </w:t>
       </w:r>
       <w:r>
         <w:rPr>
           <w:rFonts w:ascii="Aptos" w:hAnsi="Aptos" w:eastAsia="Aptos"/>
           <w:b w:val="0"/>
         </w:rPr>
-        <w:t xml:space="preserve">Нажмите карточку </w:t>
-      </w:r>
-      <w:r>
-        <w:rPr>
-          <w:rFonts w:ascii="Cascadia Mono" w:hAnsi="Cascadia Mono" w:eastAsia="Cascadia Mono"/>
-          <w:color w:val="17324D"/>
-          <w:sz w:val="18"/>
-          <w:shd w:fill="F3F5F7"/>
-        </w:rPr>
-        <w:t>Документ</w:t>
-      </w:r>
-      <w:r>
-        <w:rPr>
-          <w:rFonts w:ascii="Aptos" w:hAnsi="Aptos" w:eastAsia="Aptos"/>
-          <w:b w:val="0"/>
-        </w:rPr>
-        <w:t xml:space="preserve"> для </w:t>
-      </w:r>
-      <w:r>
-        <w:rPr>
-          <w:rFonts w:ascii="Cascadia Mono" w:hAnsi="Cascadia Mono" w:eastAsia="Cascadia Mono"/>
-          <w:color w:val="17324D"/>
-          <w:sz w:val="18"/>
-          <w:shd w:fill="F3F5F7"/>
-        </w:rPr>
-        <w:t>.docx</w:t>
-      </w:r>
-      <w:r>
-        <w:rPr>
-          <w:rFonts w:ascii="Aptos" w:hAnsi="Aptos" w:eastAsia="Aptos"/>
-          <w:b w:val="0"/>
-        </w:rPr>
-        <w:t xml:space="preserve">, </w:t>
-      </w:r>
-      <w:r>
-        <w:rPr>
-          <w:rFonts w:ascii="Cascadia Mono" w:hAnsi="Cascadia Mono" w:eastAsia="Cascadia Mono"/>
-          <w:color w:val="17324D"/>
-          <w:sz w:val="18"/>
-          <w:shd w:fill="F3F5F7"/>
-        </w:rPr>
-        <w:t>.pdf</w:t>
-      </w:r>
-      <w:r>
-        <w:rPr>
-          <w:rFonts w:ascii="Aptos" w:hAnsi="Aptos" w:eastAsia="Aptos"/>
-          <w:b w:val="0"/>
-        </w:rPr>
-        <w:t xml:space="preserve">, </w:t>
-      </w:r>
-      <w:r>
-        <w:rPr>
-          <w:rFonts w:ascii="Cascadia Mono" w:hAnsi="Cascadia Mono" w:eastAsia="Cascadia Mono"/>
-          <w:color w:val="17324D"/>
-          <w:sz w:val="18"/>
-          <w:shd w:fill="F3F5F7"/>
-        </w:rPr>
-        <w:t>.md</w:t>
-      </w:r>
-      <w:r>
-        <w:rPr>
-          <w:rFonts w:ascii="Aptos" w:hAnsi="Aptos" w:eastAsia="Aptos"/>
-          <w:b w:val="0"/>
-        </w:rPr>
-        <w:t xml:space="preserve"> или </w:t>
-      </w:r>
-      <w:r>
-        <w:rPr>
-          <w:rFonts w:ascii="Cascadia Mono" w:hAnsi="Cascadia Mono" w:eastAsia="Cascadia Mono"/>
-          <w:color w:val="17324D"/>
-          <w:sz w:val="18"/>
-          <w:shd w:fill="F3F5F7"/>
-        </w:rPr>
-        <w:t>.txt</w:t>
-      </w:r>
-      <w:r>
-        <w:rPr>
-          <w:rFonts w:ascii="Aptos" w:hAnsi="Aptos" w:eastAsia="Aptos"/>
-          <w:b w:val="0"/>
-        </w:rPr>
-        <w:t xml:space="preserve"> либо карточку </w:t>
-      </w:r>
-      <w:r>
-        <w:rPr>
-          <w:rFonts w:ascii="Cascadia Mono" w:hAnsi="Cascadia Mono" w:eastAsia="Cascadia Mono"/>
-          <w:color w:val="17324D"/>
-          <w:sz w:val="18"/>
-          <w:shd w:fill="F3F5F7"/>
-        </w:rPr>
-        <w:t>Изображение</w:t>
-      </w:r>
-      <w:r>
-        <w:rPr>
-          <w:rFonts w:ascii="Aptos" w:hAnsi="Aptos" w:eastAsia="Aptos"/>
-          <w:b w:val="0"/>
-        </w:rPr>
-        <w:t xml:space="preserve"> для </w:t>
-      </w:r>
-      <w:r>
-        <w:rPr>
-          <w:rFonts w:ascii="Cascadia Mono" w:hAnsi="Cascadia Mono" w:eastAsia="Cascadia Mono"/>
-          <w:color w:val="17324D"/>
-          <w:sz w:val="18"/>
-          <w:shd w:fill="F3F5F7"/>
-        </w:rPr>
-        <w:t>.png</w:t>
-      </w:r>
-      <w:r>
-        <w:rPr>
-          <w:rFonts w:ascii="Aptos" w:hAnsi="Aptos" w:eastAsia="Aptos"/>
-          <w:b w:val="0"/>
-        </w:rPr>
-        <w:t xml:space="preserve">, </w:t>
-      </w:r>
-      <w:r>
-        <w:rPr>
-          <w:rFonts w:ascii="Cascadia Mono" w:hAnsi="Cascadia Mono" w:eastAsia="Cascadia Mono"/>
-          <w:color w:val="17324D"/>
-          <w:sz w:val="18"/>
-          <w:shd w:fill="F3F5F7"/>
-        </w:rPr>
-        <w:t>.jpg</w:t>
-      </w:r>
-      <w:r>
-        <w:rPr>
-          <w:rFonts w:ascii="Aptos" w:hAnsi="Aptos" w:eastAsia="Aptos"/>
-          <w:b w:val="0"/>
-        </w:rPr>
-        <w:t xml:space="preserve">, </w:t>
-      </w:r>
-      <w:r>
-        <w:rPr>
-          <w:rFonts w:ascii="Cascadia Mono" w:hAnsi="Cascadia Mono" w:eastAsia="Cascadia Mono"/>
-          <w:color w:val="17324D"/>
-          <w:sz w:val="18"/>
-          <w:shd w:fill="F3F5F7"/>
-        </w:rPr>
-        <w:t>.jpeg</w:t>
-      </w:r>
-      <w:r>
-        <w:rPr>
-          <w:rFonts w:ascii="Aptos" w:hAnsi="Aptos" w:eastAsia="Aptos"/>
-          <w:b w:val="0"/>
-        </w:rPr>
-        <w:t xml:space="preserve">, </w:t>
-      </w:r>
-      <w:r>
-        <w:rPr>
-          <w:rFonts w:ascii="Cascadia Mono" w:hAnsi="Cascadia Mono" w:eastAsia="Cascadia Mono"/>
-          <w:color w:val="17324D"/>
-          <w:sz w:val="18"/>
-          <w:shd w:fill="F3F5F7"/>
-        </w:rPr>
-        <w:t>.webp</w:t>
-      </w:r>
-      <w:r>
-        <w:rPr>
-          <w:rFonts w:ascii="Aptos" w:hAnsi="Aptos" w:eastAsia="Aptos"/>
-          <w:b w:val="0"/>
-        </w:rPr>
-        <w:t xml:space="preserve">, </w:t>
-      </w:r>
-      <w:r>
-        <w:rPr>
-          <w:rFonts w:ascii="Cascadia Mono" w:hAnsi="Cascadia Mono" w:eastAsia="Cascadia Mono"/>
-          <w:color w:val="17324D"/>
-          <w:sz w:val="18"/>
-          <w:shd w:fill="F3F5F7"/>
-        </w:rPr>
-        <w:t>.tif</w:t>
-      </w:r>
-      <w:r>
-        <w:rPr>
-          <w:rFonts w:ascii="Aptos" w:hAnsi="Aptos" w:eastAsia="Aptos"/>
-          <w:b w:val="0"/>
-        </w:rPr>
-        <w:t xml:space="preserve">, </w:t>
-      </w:r>
-      <w:r>
-        <w:rPr>
-          <w:rFonts w:ascii="Cascadia Mono" w:hAnsi="Cascadia Mono" w:eastAsia="Cascadia Mono"/>
-          <w:color w:val="17324D"/>
-          <w:sz w:val="18"/>
-          <w:shd w:fill="F3F5F7"/>
-        </w:rPr>
-        <w:t>.tiff</w:t>
-      </w:r>
-      <w:r>
-        <w:rPr>
-          <w:rFonts w:ascii="Aptos" w:hAnsi="Aptos" w:eastAsia="Aptos"/>
-          <w:b w:val="0"/>
-        </w:rPr>
-        <w:t xml:space="preserve"> или </w:t>
-      </w:r>
-      <w:r>
-        <w:rPr>
-          <w:rFonts w:ascii="Cascadia Mono" w:hAnsi="Cascadia Mono" w:eastAsia="Cascadia Mono"/>
-          <w:color w:val="17324D"/>
-          <w:sz w:val="18"/>
-          <w:shd w:fill="F3F5F7"/>
-        </w:rPr>
-        <w:t>.bmp</w:t>
-      </w:r>
-      <w:r>
-        <w:rPr>
-          <w:rFonts w:ascii="Aptos" w:hAnsi="Aptos" w:eastAsia="Aptos"/>
-          <w:b w:val="0"/>
-        </w:rPr>
-        <w:t>. Можно выбрать несколько файлов.</w:t>
+        <w:t>Наведите указатель на нужный проект в левой панели.</w:t>
       </w:r>
     </w:p>
     <w:p>
@@ -1869,14 +1764,14 @@
           <w:rFonts w:ascii="Aptos" w:hAnsi="Aptos" w:eastAsia="Aptos"/>
           <w:color w:val="17324D"/>
         </w:rPr>
-        <w:t xml:space="preserve">5.  </w:t>
+        <w:t xml:space="preserve">2.  </w:t>
       </w:r>
       <w:r>
         <w:rPr>
           <w:rFonts w:ascii="Aptos" w:hAnsi="Aptos" w:eastAsia="Aptos"/>
           <w:b w:val="0"/>
         </w:rPr>
-        <w:t xml:space="preserve">Проверьте список выбранных файлов и при необходимости уберите лишний файл кнопкой рядом с его именем. Кнопка отправки заранее показывает назначение: </w:t>
+        <w:t xml:space="preserve">Выберите </w:t>
       </w:r>
       <w:r>
         <w:rPr>
@@ -1885,23 +1780,7 @@
           <w:sz w:val="18"/>
           <w:shd w:fill="F3F5F7"/>
         </w:rPr>
-        <w:t>Загрузить в чат</w:t>
-      </w:r>
-      <w:r>
-        <w:rPr>
-          <w:rFonts w:ascii="Aptos" w:hAnsi="Aptos" w:eastAsia="Aptos"/>
-          <w:b w:val="0"/>
-        </w:rPr>
-        <w:t xml:space="preserve"> или </w:t>
-      </w:r>
-      <w:r>
-        <w:rPr>
-          <w:rFonts w:ascii="Cascadia Mono" w:hAnsi="Cascadia Mono" w:eastAsia="Cascadia Mono"/>
-          <w:color w:val="17324D"/>
-          <w:sz w:val="18"/>
-          <w:shd w:fill="F3F5F7"/>
-        </w:rPr>
-        <w:t>Загрузить в проект</w:t>
+        <w:t>Память и документы</w:t>
       </w:r>
       <w:r>
         <w:rPr>
@@ -1921,14 +1800,30 @@
           <w:rFonts w:ascii="Aptos" w:hAnsi="Aptos" w:eastAsia="Aptos"/>
           <w:color w:val="17324D"/>
         </w:rPr>
-        <w:t xml:space="preserve">6.  </w:t>
+        <w:t xml:space="preserve">3.  </w:t>
       </w:r>
       <w:r>
         <w:rPr>
           <w:rFonts w:ascii="Aptos" w:hAnsi="Aptos" w:eastAsia="Aptos"/>
           <w:b w:val="0"/>
         </w:rPr>
-        <w:t>Нажмите загрузку. API быстро примет файлы и поставит их в очередь. Закрывать страницу не требуется: состояние хранится на сервере и восстановится после обновления браузера.</w:t>
+        <w:t xml:space="preserve">В блоке </w:t>
+      </w:r>
+      <w:r>
+        <w:rPr>
+          <w:rFonts w:ascii="Cascadia Mono" w:hAnsi="Cascadia Mono" w:eastAsia="Cascadia Mono"/>
+          <w:color w:val="17324D"/>
+          <w:sz w:val="18"/>
+          <w:shd w:fill="F3F5F7"/>
+        </w:rPr>
+        <w:t>Загрузить в проект</w:t>
+      </w:r>
+      <w:r>
+        <w:rPr>
+          <w:rFonts w:ascii="Aptos" w:hAnsi="Aptos" w:eastAsia="Aptos"/>
+          <w:b w:val="0"/>
+        </w:rPr>
+        <w:t xml:space="preserve"> выберите документы или изображения.</w:t>
       </w:r>
     </w:p>
     <w:p>
@@ -1941,14 +1836,145 @@
           <w:rFonts w:ascii="Aptos" w:hAnsi="Aptos" w:eastAsia="Aptos"/>
           <w:color w:val="17324D"/>
         </w:rPr>
-        <w:t xml:space="preserve">7.  </w:t>
+        <w:t xml:space="preserve">4.  </w:t>
       </w:r>
       <w:r>
         <w:rPr>
           <w:rFonts w:ascii="Aptos" w:hAnsi="Aptos" w:eastAsia="Aptos"/>
           <w:b w:val="0"/>
         </w:rPr>
-        <w:t>Следите за разделами в левой панели:</w:t>
+        <w:t xml:space="preserve">Нажмите </w:t>
+      </w:r>
+      <w:r>
+        <w:rPr>
+          <w:rFonts w:ascii="Cascadia Mono" w:hAnsi="Cascadia Mono" w:eastAsia="Cascadia Mono"/>
+          <w:color w:val="17324D"/>
+          <w:sz w:val="18"/>
+          <w:shd w:fill="F3F5F7"/>
+        </w:rPr>
+        <w:t>Загрузить в проект</w:t>
+      </w:r>
+      <w:r>
+        <w:rPr>
+          <w:rFonts w:ascii="Aptos" w:hAnsi="Aptos" w:eastAsia="Aptos"/>
+          <w:b w:val="0"/>
+        </w:rPr>
+        <w:t>.</w:t>
+      </w:r>
+    </w:p>
+    <w:p>
+      <w:r>
+        <w:rPr>
+          <w:rFonts w:ascii="Aptos" w:hAnsi="Aptos" w:eastAsia="Aptos"/>
+          <w:b w:val="0"/>
+        </w:rPr>
+        <w:t>Файл останется приватным для владельца проекта, но будет доступен во всех чатах этого проекта. В этой же панели показаны память, область источников, версии, статусы и ссылки на исходные документы проекта.</w:t>
+      </w:r>
+    </w:p>
+    <w:p>
+      <w:pPr>
+        <w:pStyle w:val="Heading2"/>
+      </w:pPr>
+      <w:r>
+        <w:rPr>
+          <w:rFonts w:ascii="Aptos" w:hAnsi="Aptos" w:eastAsia="Aptos"/>
+          <w:b w:val="0"/>
+        </w:rPr>
+        <w:t>Общая база знаний</w:t>
+      </w:r>
+    </w:p>
+    <w:p>
+      <w:r>
+        <w:rPr>
+          <w:rFonts w:ascii="Aptos" w:hAnsi="Aptos" w:eastAsia="Aptos"/>
+          <w:b w:val="0"/>
+        </w:rPr>
+        <w:t xml:space="preserve">Только администратор может добавлять общие документы. Для этого откройте техническую панель справа, вкладку </w:t>
+      </w:r>
+      <w:r>
+        <w:rPr>
+          <w:rFonts w:ascii="Cascadia Mono" w:hAnsi="Cascadia Mono" w:eastAsia="Cascadia Mono"/>
+          <w:color w:val="17324D"/>
+          <w:sz w:val="18"/>
+          <w:shd w:fill="F3F5F7"/>
+        </w:rPr>
+        <w:t>Система</w:t>
+      </w:r>
+      <w:r>
+        <w:rPr>
+          <w:rFonts w:ascii="Aptos" w:hAnsi="Aptos" w:eastAsia="Aptos"/>
+          <w:b w:val="0"/>
+        </w:rPr>
+        <w:t xml:space="preserve">, блок </w:t>
+      </w:r>
+      <w:r>
+        <w:rPr>
+          <w:rFonts w:ascii="Cascadia Mono" w:hAnsi="Cascadia Mono" w:eastAsia="Cascadia Mono"/>
+          <w:color w:val="17324D"/>
+          <w:sz w:val="18"/>
+          <w:shd w:fill="F3F5F7"/>
+        </w:rPr>
+        <w:t>Общая база знаний</w:t>
+      </w:r>
+      <w:r>
+        <w:rPr>
+          <w:rFonts w:ascii="Aptos" w:hAnsi="Aptos" w:eastAsia="Aptos"/>
+          <w:b w:val="0"/>
+        </w:rPr>
+        <w:t xml:space="preserve">, выберите файлы и нажмите </w:t>
+      </w:r>
+      <w:r>
+        <w:rPr>
+          <w:rFonts w:ascii="Cascadia Mono" w:hAnsi="Cascadia Mono" w:eastAsia="Cascadia Mono"/>
+          <w:color w:val="17324D"/>
+          <w:sz w:val="18"/>
+          <w:shd w:fill="F3F5F7"/>
+        </w:rPr>
+        <w:t>Загрузить в общую базу</w:t>
+      </w:r>
+      <w:r>
+        <w:rPr>
+          <w:rFonts w:ascii="Aptos" w:hAnsi="Aptos" w:eastAsia="Aptos"/>
+          <w:b w:val="0"/>
+        </w:rPr>
+        <w:t xml:space="preserve">. Общий документ становится доступен всем пользователям и проектам, у которых не включён режим </w:t>
+      </w:r>
+      <w:r>
+        <w:rPr>
+          <w:rFonts w:ascii="Cascadia Mono" w:hAnsi="Cascadia Mono" w:eastAsia="Cascadia Mono"/>
+          <w:color w:val="17324D"/>
+          <w:sz w:val="18"/>
+          <w:shd w:fill="F3F5F7"/>
+        </w:rPr>
+        <w:t>Только документы проекта</w:t>
+      </w:r>
+      <w:r>
+        <w:rPr>
+          <w:rFonts w:ascii="Aptos" w:hAnsi="Aptos" w:eastAsia="Aptos"/>
+          <w:b w:val="0"/>
+        </w:rPr>
+        <w:t>. Обычный пользователь видит в технической панели только сообщение о доступности общей базы без формы загрузки.</w:t>
+      </w:r>
+    </w:p>
+    <w:p>
+      <w:pPr>
+        <w:pStyle w:val="Heading2"/>
+      </w:pPr>
+      <w:r>
+        <w:rPr>
+          <w:rFonts w:ascii="Aptos" w:hAnsi="Aptos" w:eastAsia="Aptos"/>
+          <w:b w:val="0"/>
+        </w:rPr>
+        <w:t>Обработка и реестр</w:t>
+      </w:r>
+    </w:p>
+    <w:p>
+      <w:r>
+        <w:rPr>
+          <w:rFonts w:ascii="Aptos" w:hAnsi="Aptos" w:eastAsia="Aptos"/>
+          <w:b w:val="0"/>
+        </w:rPr>
+        <w:t>После загрузки API быстро принимает файлы и ставит их в очередь. Состояние хранится на сервере и восстанавливается после обновления браузера. Следите за реестром:</w:t>
       </w:r>
     </w:p>
     <w:p>
@@ -1990,7 +2016,23 @@
           <w:rFonts w:ascii="Aptos" w:hAnsi="Aptos" w:eastAsia="Aptos"/>
           <w:b w:val="0"/>
         </w:rPr>
-        <w:t xml:space="preserve"> — приватные файлы, доступные всем чатам проекта;</w:t>
+        <w:t xml:space="preserve"> — в панели </w:t>
+      </w:r>
+      <w:r>
+        <w:rPr>
+          <w:rFonts w:ascii="Cascadia Mono" w:hAnsi="Cascadia Mono" w:eastAsia="Cascadia Mono"/>
+          <w:color w:val="17324D"/>
+          <w:sz w:val="18"/>
+          <w:shd w:fill="F3F5F7"/>
+        </w:rPr>
+        <w:t>Память и документы</w:t>
+      </w:r>
+      <w:r>
+        <w:rPr>
+          <w:rFonts w:ascii="Aptos" w:hAnsi="Aptos" w:eastAsia="Aptos"/>
+          <w:b w:val="0"/>
+        </w:rPr>
+        <w:t xml:space="preserve"> выбранного проекта;</w:t>
       </w:r>
     </w:p>
     <w:p>
@@ -2129,17 +2171,6 @@
       </w:r>
     </w:p>
     <w:p>
-      <w:pPr>
-        <w:spacing w:after="60"/>
-        <w:ind w:left="425" w:hanging="272"/>
-      </w:pPr>
-      <w:r>
-        <w:rPr>
-          <w:rFonts w:ascii="Aptos" w:hAnsi="Aptos" w:eastAsia="Aptos"/>
-          <w:color w:val="17324D"/>
-        </w:rPr>
-        <w:t xml:space="preserve">8.  </w:t>
-      </w:r>
       <w:r>
         <w:rPr>
           <w:rFonts w:ascii="Aptos" w:hAnsi="Aptos" w:eastAsia="Aptos"/>
@@ -2161,97 +2192,25 @@
           <w:rFonts w:ascii="Aptos" w:hAnsi="Aptos" w:eastAsia="Aptos"/>
           <w:b w:val="0"/>
         </w:rPr>
-        <w:t xml:space="preserve"> проверьте ненулевое число чанков. Нулевое значение означает, что текст не извлечён или реестр ещё не обновился.</w:t>
+        <w:t xml:space="preserve"> проверьте ненулевое число чанков. Нулевое значение означает, что текст не извлечён или реестр ещё не обновился. Нажмите имя документа, чтобы открыть или скачать исходный файл. Чтобы удалить приватный документ, нажмите кнопку с корзиной справа от его строки и подтвердите действие. Документ сразу исчезает из доступной области и перестаёт участвовать в новых ответах; удаление чанков из Qdrant и BM25 и исходного файла выполняется через ту же последовательную очередь, что и индексация. Действие необратимо. Общий документ может удалить только администратор, потому что это влияет на всех пользователей.</w:t>
       </w:r>
     </w:p>
     <w:p>
-      <w:pPr>
-        <w:spacing w:after="60"/>
-        <w:ind w:left="425" w:hanging="272"/>
-      </w:pPr>
-      <w:r>
-        <w:rPr>
-          <w:rFonts w:ascii="Aptos" w:hAnsi="Aptos" w:eastAsia="Aptos"/>
-          <w:color w:val="17324D"/>
-        </w:rPr>
-        <w:t xml:space="preserve">9.  </w:t>
-      </w:r>
       <w:r>
         <w:rPr>
           <w:rFonts w:ascii="Aptos" w:hAnsi="Aptos" w:eastAsia="Aptos"/>
           <w:b w:val="0"/>
         </w:rPr>
-        <w:t>Нажмите имя документа в левой панели, чтобы открыть или скачать именно исходный файл. Техническая панель справа используется для новой загрузки и показывает только краткий счётчик, чтобы не дублировать реестр.</w:t>
+        <w:t>Если после подтверждения показано сообщение, что документ скрыт, но очередь очистки недоступна, не загружайте тот же файл повторно. Он уже исключён из поиска, однако администратору нужно повторить физическую очистку по job ID.</w:t>
       </w:r>
     </w:p>
     <w:p>
-      <w:pPr>
-        <w:spacing w:after="60"/>
-        <w:ind w:left="425" w:hanging="272"/>
-      </w:pPr>
-      <w:r>
-        <w:rPr>
-          <w:rFonts w:ascii="Aptos" w:hAnsi="Aptos" w:eastAsia="Aptos"/>
-          <w:color w:val="17324D"/>
-        </w:rPr>
-        <w:t xml:space="preserve">10.  </w:t>
-      </w:r>
       <w:r>
         <w:rPr>
           <w:rFonts w:ascii="Aptos" w:hAnsi="Aptos" w:eastAsia="Aptos"/>
           <w:b w:val="0"/>
         </w:rPr>
-        <w:t>Чтобы удалить приватный документ, нажмите кнопку с корзиной справа от его строки и подтвердите действие. Документ сразу исчезает из доступной области и перестаёт участвовать в новых ответах; удаление чанков из Qdrant и BM25 и исходного файла выполняется через ту же последовательную очередь, что и индексация. Действие необратимо. Общий документ может удалить только администратор, потому что это влияет на всех пользователей.</w:t>
-      </w:r>
-    </w:p>
-    <w:p>
-      <w:r>
-        <w:rPr>
-          <w:rFonts w:ascii="Aptos" w:hAnsi="Aptos" w:eastAsia="Aptos"/>
-          <w:b w:val="0"/>
-        </w:rPr>
-        <w:t>Если после подтверждения показано сообщение, что документ скрыт, но очередь очистки недоступна, не загружайте тот же файл повторно. Он уже исключён из поиска, однако администратору нужно повторить физическую очистку по job ID.</w:t>
-      </w:r>
-    </w:p>
-    <w:p>
-      <w:r>
-        <w:rPr>
-          <w:rFonts w:ascii="Aptos" w:hAnsi="Aptos" w:eastAsia="Aptos"/>
-          <w:b w:val="0"/>
-        </w:rPr>
-        <w:t xml:space="preserve">Тот же выбор области доступен в блоке </w:t>
-      </w:r>
-      <w:r>
-        <w:rPr>
-          <w:rFonts w:ascii="Cascadia Mono" w:hAnsi="Cascadia Mono" w:eastAsia="Cascadia Mono"/>
-          <w:color w:val="17324D"/>
-          <w:sz w:val="18"/>
-          <w:shd w:fill="F3F5F7"/>
-        </w:rPr>
-        <w:t>База знаний</w:t>
-      </w:r>
-      <w:r>
-        <w:rPr>
-          <w:rFonts w:ascii="Aptos" w:hAnsi="Aptos" w:eastAsia="Aptos"/>
-          <w:b w:val="0"/>
-        </w:rPr>
-        <w:t xml:space="preserve"> технической панели. Кнопка </w:t>
-      </w:r>
-      <w:r>
-        <w:rPr>
-          <w:rFonts w:ascii="Cascadia Mono" w:hAnsi="Cascadia Mono" w:eastAsia="Cascadia Mono"/>
-          <w:color w:val="17324D"/>
-          <w:sz w:val="18"/>
-          <w:shd w:fill="F3F5F7"/>
-        </w:rPr>
-        <w:t>+</w:t>
-      </w:r>
-      <w:r>
-        <w:rPr>
-          <w:rFonts w:ascii="Aptos" w:hAnsi="Aptos" w:eastAsia="Aptos"/>
-          <w:b w:val="0"/>
-        </w:rPr>
-        <w:t xml:space="preserve"> рядом с вопросом предназначена для обычной ежедневной работы, а правая панель — для диагностики и расширенных настроек.</w:t>
+        <w:t>Правая техническая панель не используется для проектных или чатовых файлов. Она содержит административную форму общей базы и диагностические сведения о последнем ответе.</w:t>
       </w:r>
     </w:p>
     <w:p>
@@ -3511,7 +3470,7 @@
           <w:rFonts w:ascii="Aptos" w:hAnsi="Aptos" w:eastAsia="Aptos"/>
           <w:b w:val="0"/>
         </w:rPr>
-        <w:t xml:space="preserve">/«Источники». Раздел </w:t>
+        <w:t xml:space="preserve">/«Источники». Реестр </w:t>
       </w:r>
       <w:r>
         <w:rPr>
@@ -3527,7 +3486,7 @@
           <w:rFonts w:ascii="Aptos" w:hAnsi="Aptos" w:eastAsia="Aptos"/>
           <w:b w:val="0"/>
         </w:rPr>
-        <w:t>/</w:t>
+        <w:t xml:space="preserve"> находится в меню </w:t>
       </w:r>
       <w:r>
         <w:rPr>
@@ -3536,14 +3495,30 @@
           <w:sz w:val="18"/>
           <w:shd w:fill="F3F5F7"/>
         </w:rPr>
-        <w:t>Документы чата</w:t>
+        <w:t>Память и документы</w:t>
       </w:r>
       <w:r>
         <w:rPr>
           <w:rFonts w:ascii="Aptos" w:hAnsi="Aptos" w:eastAsia="Aptos"/>
           <w:b w:val="0"/>
         </w:rPr>
-        <w:t xml:space="preserve"> слева — это отдельный реестр всех загруженных файлов текущей области, включая дату, версию и статус обработки. Старые ответы с техническим UUID автоматически отображаются в новом виде после обновления UI.</w:t>
+        <w:t xml:space="preserve"> проекта, а </w:t>
+      </w:r>
+      <w:r>
+        <w:rPr>
+          <w:rFonts w:ascii="Cascadia Mono" w:hAnsi="Cascadia Mono" w:eastAsia="Cascadia Mono"/>
+          <w:color w:val="17324D"/>
+          <w:sz w:val="18"/>
+          <w:shd w:fill="F3F5F7"/>
+        </w:rPr>
+        <w:t>Документы чата</w:t>
+      </w:r>
+      <w:r>
+        <w:rPr>
+          <w:rFonts w:ascii="Aptos" w:hAnsi="Aptos" w:eastAsia="Aptos"/>
+          <w:b w:val="0"/>
+        </w:rPr>
+        <w:t xml:space="preserve"> — в левой панели активного чата. Реестры показывают дату, версию и статус обработки. Старые ответы с техническим UUID автоматически отображаются в новом виде после обновления UI.</w:t>
       </w:r>
     </w:p>
     <w:p>

</xml_diff>

<commit_message>
Update production acceptance documentation
</commit_message>
<xml_diff>
--- a/docs/Руководство_пользователя_RAG_Assistant.docx
+++ b/docs/Руководство_пользователя_RAG_Assistant.docx
@@ -1723,6 +1723,15 @@
       </w:r>
     </w:p>
     <w:p>
+      <w:r>
+        <w:rPr>
+          <w:rFonts w:ascii="Aptos" w:hAnsi="Aptos" w:eastAsia="Aptos"/>
+          <w:b w:val="0"/>
+        </w:rPr>
+        <w:t>Если содержание чатового файла совпадает с вопросом, система резервирует для него место среди доказательств: большой общий документ не должен вытеснить релевантное вложение только из-за размера или количества повторяющихся слов.</w:t>
+      </w:r>
+    </w:p>
+    <w:p>
       <w:pPr>
         <w:pStyle w:val="Heading2"/>
       </w:pPr>
@@ -1872,88 +1881,12 @@
       </w:r>
     </w:p>
     <w:p>
-      <w:pPr>
-        <w:pStyle w:val="Heading2"/>
-      </w:pPr>
       <w:r>
         <w:rPr>
           <w:rFonts w:ascii="Aptos" w:hAnsi="Aptos" w:eastAsia="Aptos"/>
           <w:b w:val="0"/>
         </w:rPr>
-        <w:t>Общая база знаний</w:t>
-      </w:r>
-    </w:p>
-    <w:p>
-      <w:r>
-        <w:rPr>
-          <w:rFonts w:ascii="Aptos" w:hAnsi="Aptos" w:eastAsia="Aptos"/>
-          <w:b w:val="0"/>
-        </w:rPr>
-        <w:t xml:space="preserve">Только администратор может добавлять общие документы. Для этого откройте техническую панель справа, вкладку </w:t>
-      </w:r>
-      <w:r>
-        <w:rPr>
-          <w:rFonts w:ascii="Cascadia Mono" w:hAnsi="Cascadia Mono" w:eastAsia="Cascadia Mono"/>
-          <w:color w:val="17324D"/>
-          <w:sz w:val="18"/>
-          <w:shd w:fill="F3F5F7"/>
-        </w:rPr>
-        <w:t>Система</w:t>
-      </w:r>
-      <w:r>
-        <w:rPr>
-          <w:rFonts w:ascii="Aptos" w:hAnsi="Aptos" w:eastAsia="Aptos"/>
-          <w:b w:val="0"/>
-        </w:rPr>
-        <w:t xml:space="preserve">, блок </w:t>
-      </w:r>
-      <w:r>
-        <w:rPr>
-          <w:rFonts w:ascii="Cascadia Mono" w:hAnsi="Cascadia Mono" w:eastAsia="Cascadia Mono"/>
-          <w:color w:val="17324D"/>
-          <w:sz w:val="18"/>
-          <w:shd w:fill="F3F5F7"/>
-        </w:rPr>
-        <w:t>Общая база знаний</w:t>
-      </w:r>
-      <w:r>
-        <w:rPr>
-          <w:rFonts w:ascii="Aptos" w:hAnsi="Aptos" w:eastAsia="Aptos"/>
-          <w:b w:val="0"/>
-        </w:rPr>
-        <w:t xml:space="preserve">, выберите файлы и нажмите </w:t>
-      </w:r>
-      <w:r>
-        <w:rPr>
-          <w:rFonts w:ascii="Cascadia Mono" w:hAnsi="Cascadia Mono" w:eastAsia="Cascadia Mono"/>
-          <w:color w:val="17324D"/>
-          <w:sz w:val="18"/>
-          <w:shd w:fill="F3F5F7"/>
-        </w:rPr>
-        <w:t>Загрузить в общую базу</w:t>
-      </w:r>
-      <w:r>
-        <w:rPr>
-          <w:rFonts w:ascii="Aptos" w:hAnsi="Aptos" w:eastAsia="Aptos"/>
-          <w:b w:val="0"/>
-        </w:rPr>
-        <w:t xml:space="preserve">. Общий документ становится доступен всем пользователям и проектам, у которых не включён режим </w:t>
-      </w:r>
-      <w:r>
-        <w:rPr>
-          <w:rFonts w:ascii="Cascadia Mono" w:hAnsi="Cascadia Mono" w:eastAsia="Cascadia Mono"/>
-          <w:color w:val="17324D"/>
-          <w:sz w:val="18"/>
-          <w:shd w:fill="F3F5F7"/>
-        </w:rPr>
-        <w:t>Только документы проекта</w:t>
-      </w:r>
-      <w:r>
-        <w:rPr>
-          <w:rFonts w:ascii="Aptos" w:hAnsi="Aptos" w:eastAsia="Aptos"/>
-          <w:b w:val="0"/>
-        </w:rPr>
-        <w:t>. Обычный пользователь видит в технической панели только сообщение о доступности общей базы без формы загрузки.</w:t>
+        <w:t>Проектный файл обрабатывается наравне с общими документами выбранной области, но при содержательном совпадении получает ограниченный приоритет в выдаче. Это не отключает общую библиотеку: итоговый ответ может объединить проектные и общие доказательства, если настройка проекта разрешает оба корпуса.</w:t>
       </w:r>
     </w:p>
     <w:p>
@@ -1965,6 +1898,91 @@
           <w:rFonts w:ascii="Aptos" w:hAnsi="Aptos" w:eastAsia="Aptos"/>
           <w:b w:val="0"/>
         </w:rPr>
+        <w:t>Общая база знаний</w:t>
+      </w:r>
+    </w:p>
+    <w:p>
+      <w:r>
+        <w:rPr>
+          <w:rFonts w:ascii="Aptos" w:hAnsi="Aptos" w:eastAsia="Aptos"/>
+          <w:b w:val="0"/>
+        </w:rPr>
+        <w:t xml:space="preserve">Только администратор может добавлять общие документы. Для этого откройте техническую панель справа, вкладку </w:t>
+      </w:r>
+      <w:r>
+        <w:rPr>
+          <w:rFonts w:ascii="Cascadia Mono" w:hAnsi="Cascadia Mono" w:eastAsia="Cascadia Mono"/>
+          <w:color w:val="17324D"/>
+          <w:sz w:val="18"/>
+          <w:shd w:fill="F3F5F7"/>
+        </w:rPr>
+        <w:t>Система</w:t>
+      </w:r>
+      <w:r>
+        <w:rPr>
+          <w:rFonts w:ascii="Aptos" w:hAnsi="Aptos" w:eastAsia="Aptos"/>
+          <w:b w:val="0"/>
+        </w:rPr>
+        <w:t xml:space="preserve">, блок </w:t>
+      </w:r>
+      <w:r>
+        <w:rPr>
+          <w:rFonts w:ascii="Cascadia Mono" w:hAnsi="Cascadia Mono" w:eastAsia="Cascadia Mono"/>
+          <w:color w:val="17324D"/>
+          <w:sz w:val="18"/>
+          <w:shd w:fill="F3F5F7"/>
+        </w:rPr>
+        <w:t>Общая база знаний</w:t>
+      </w:r>
+      <w:r>
+        <w:rPr>
+          <w:rFonts w:ascii="Aptos" w:hAnsi="Aptos" w:eastAsia="Aptos"/>
+          <w:b w:val="0"/>
+        </w:rPr>
+        <w:t xml:space="preserve">, выберите файлы и нажмите </w:t>
+      </w:r>
+      <w:r>
+        <w:rPr>
+          <w:rFonts w:ascii="Cascadia Mono" w:hAnsi="Cascadia Mono" w:eastAsia="Cascadia Mono"/>
+          <w:color w:val="17324D"/>
+          <w:sz w:val="18"/>
+          <w:shd w:fill="F3F5F7"/>
+        </w:rPr>
+        <w:t>Загрузить в общую базу</w:t>
+      </w:r>
+      <w:r>
+        <w:rPr>
+          <w:rFonts w:ascii="Aptos" w:hAnsi="Aptos" w:eastAsia="Aptos"/>
+          <w:b w:val="0"/>
+        </w:rPr>
+        <w:t xml:space="preserve">. Общий документ становится доступен всем пользователям и проектам, у которых не включён режим </w:t>
+      </w:r>
+      <w:r>
+        <w:rPr>
+          <w:rFonts w:ascii="Cascadia Mono" w:hAnsi="Cascadia Mono" w:eastAsia="Cascadia Mono"/>
+          <w:color w:val="17324D"/>
+          <w:sz w:val="18"/>
+          <w:shd w:fill="F3F5F7"/>
+        </w:rPr>
+        <w:t>Только документы проекта</w:t>
+      </w:r>
+      <w:r>
+        <w:rPr>
+          <w:rFonts w:ascii="Aptos" w:hAnsi="Aptos" w:eastAsia="Aptos"/>
+          <w:b w:val="0"/>
+        </w:rPr>
+        <w:t>. Обычный пользователь видит в технической панели только сообщение о доступности общей базы без формы загрузки.</w:t>
+      </w:r>
+    </w:p>
+    <w:p>
+      <w:pPr>
+        <w:pStyle w:val="Heading2"/>
+      </w:pPr>
+      <w:r>
+        <w:rPr>
+          <w:rFonts w:ascii="Aptos" w:hAnsi="Aptos" w:eastAsia="Aptos"/>
+          <w:b w:val="0"/>
+        </w:rPr>
         <w:t>Обработка и реестр</w:t>
       </w:r>
     </w:p>
@@ -2258,6 +2276,47 @@
           <w:rFonts w:ascii="Aptos" w:hAnsi="Aptos" w:eastAsia="Aptos"/>
           <w:b w:val="0"/>
         </w:rPr>
+        <w:t xml:space="preserve">Для нормативного Markdown оставляйте номер пункта в начале отдельной строки, например </w:t>
+      </w:r>
+      <w:r>
+        <w:rPr>
+          <w:rFonts w:ascii="Cascadia Mono" w:hAnsi="Cascadia Mono" w:eastAsia="Cascadia Mono"/>
+          <w:color w:val="17324D"/>
+          <w:sz w:val="18"/>
+          <w:shd w:fill="F3F5F7"/>
+        </w:rPr>
+        <w:t>159.1. Текст пункта</w:t>
+      </w:r>
+      <w:r>
+        <w:rPr>
+          <w:rFonts w:ascii="Aptos" w:hAnsi="Aptos" w:eastAsia="Aptos"/>
+          <w:b w:val="0"/>
+        </w:rPr>
+        <w:t xml:space="preserve">. При новой загрузке такие границы превращаются в понятные ориентиры </w:t>
+      </w:r>
+      <w:r>
+        <w:rPr>
+          <w:rFonts w:ascii="Cascadia Mono" w:hAnsi="Cascadia Mono" w:eastAsia="Cascadia Mono"/>
+          <w:color w:val="17324D"/>
+          <w:sz w:val="18"/>
+          <w:shd w:fill="F3F5F7"/>
+        </w:rPr>
+        <w:t>Пункт 159.1</w:t>
+      </w:r>
+      <w:r>
+        <w:rPr>
+          <w:rFonts w:ascii="Aptos" w:hAnsi="Aptos" w:eastAsia="Aptos"/>
+          <w:b w:val="0"/>
+        </w:rPr>
+        <w:t>. У ранее загруженного Markdown ориентир может оставаться пустым: чтобы получить разбиение по пунктам, удалите старую запись и загрузите файл заново в нужный чат или проект. Автоматического переноса между проектным и общим корпусом нет.</w:t>
+      </w:r>
+    </w:p>
+    <w:p>
+      <w:r>
+        <w:rPr>
+          <w:rFonts w:ascii="Aptos" w:hAnsi="Aptos" w:eastAsia="Aptos"/>
+          <w:b w:val="0"/>
+        </w:rPr>
         <w:t>Все документы, находившиеся в системе до введения персональных учётных записей, перенесены в общий корпус. Обычный пользователь не может сделать новый файл общим через проектную форму загрузки; публикация в общий корпус — отдельное административное действие. Удаление или замена общего документа влияет на всех пользователей и должно выполняться только после проверки новой редакции.</w:t>
       </w:r>
     </w:p>
@@ -2571,6 +2630,31 @@
           <w:b w:val="0"/>
         </w:rPr>
         <w:t>. Если опечатка меняет специальный термин или номер пункта, система не угадывает молча: уточните обозначение в следующем сообщении.</w:t>
+      </w:r>
+    </w:p>
+    <w:p>
+      <w:r>
+        <w:rPr>
+          <w:rFonts w:ascii="Aptos" w:hAnsi="Aptos" w:eastAsia="Aptos"/>
+          <w:b w:val="0"/>
+        </w:rPr>
+        <w:t xml:space="preserve">Если в вопросе явно назван доступный документ или нормативный акт, например </w:t>
+      </w:r>
+      <w:r>
+        <w:rPr>
+          <w:rFonts w:ascii="Cascadia Mono" w:hAnsi="Cascadia Mono" w:eastAsia="Cascadia Mono"/>
+          <w:color w:val="17324D"/>
+          <w:sz w:val="18"/>
+          <w:shd w:fill="F3F5F7"/>
+        </w:rPr>
+        <w:t>по ПП 442</w:t>
+      </w:r>
+      <w:r>
+        <w:rPr>
+          <w:rFonts w:ascii="Aptos" w:hAnsi="Aptos" w:eastAsia="Aptos"/>
+          <w:b w:val="0"/>
+        </w:rPr>
+        <w:t>, система воспринимает это как указание на источник и сначала ищет доказательства в нём. Без явного имени релевантные документы текущего чата и проекта всё равно участвуют в общем поиске и не должны теряться за крупными общими файлами.</w:t>
       </w:r>
     </w:p>
     <w:p>
@@ -3957,7 +4041,7 @@
           <w:rFonts w:ascii="Aptos" w:hAnsi="Aptos" w:eastAsia="Aptos"/>
           <w:b w:val="0"/>
         </w:rPr>
-        <w:t>Кэш точный: он возвращает ранее сгенерированный ответ только для совпадающего набора вопроса, контекстуализированного retrieval-запроса, модели, системного профиля, памяти проекта и области документов. Похожие формулировки не считаются одним запросом. После индексации корпус меняется, и ответы инвалидируются.</w:t>
+        <w:t>Кэш точный и проверяется только после retrieval. Готовый ответ можно повторно использовать между разными пользователями, только когда все его доказательства однозначно относятся к действующим общим документам и вопрос не зависит от истории чата. Если найден хотя бы один документ проекта/чата, неоднозначный источник или контекст предыдущей реплики, чтение и запись кэша отключаются. Похожие формулировки не считаются одним запросом. После индексации корпус меняется, и ответы инвалидируются.</w:t>
       </w:r>
     </w:p>
     <w:p>
@@ -3982,7 +4066,23 @@
           <w:rFonts w:ascii="Aptos" w:hAnsi="Aptos" w:eastAsia="Aptos"/>
           <w:b w:val="0"/>
         </w:rPr>
-        <w:t xml:space="preserve"> означает повторное использование проверенного результата, а не пропуск авторизации или retrieval-изоляции. Идентичный вопрос в другом проекте, у другого пользователя или при другой области знаний не может получить ответ из несовместимого кэша.</w:t>
+        <w:t xml:space="preserve"> означает повторное использование проверенного общего результата, а не пропуск авторизации или retrieval-изоляции. Приватные ответы не попадают в answer cache. Очереди используют другой Redis с сохранением на диск и политикой </w:t>
+      </w:r>
+      <w:r>
+        <w:rPr>
+          <w:rFonts w:ascii="Cascadia Mono" w:hAnsi="Cascadia Mono" w:eastAsia="Cascadia Mono"/>
+          <w:color w:val="17324D"/>
+          <w:sz w:val="18"/>
+          <w:shd w:fill="F3F5F7"/>
+        </w:rPr>
+        <w:t>noeviction</w:t>
+      </w:r>
+      <w:r>
+        <w:rPr>
+          <w:rFonts w:ascii="Aptos" w:hAnsi="Aptos" w:eastAsia="Aptos"/>
+          <w:b w:val="0"/>
+        </w:rPr>
+        <w:t>, поэтому переполнение вытесняемого кэша не удаляет и не блокирует задания загрузки или генерации.</w:t>
       </w:r>
     </w:p>
     <w:p>

</xml_diff>

<commit_message>
Allow testers to manage shared documents
</commit_message>
<xml_diff>
--- a/docs/Руководство_пользователя_RAG_Assistant.docx
+++ b/docs/Руководство_пользователя_RAG_Assistant.docx
@@ -1907,7 +1907,7 @@
           <w:rFonts w:ascii="Aptos" w:hAnsi="Aptos" w:eastAsia="Aptos"/>
           <w:b w:val="0"/>
         </w:rPr>
-        <w:t xml:space="preserve">Только администратор может добавлять общие документы. Для этого откройте техническую панель справа, вкладку </w:t>
+        <w:t xml:space="preserve">В текущей тестовой среде любой авторизованный пользователь может добавлять общие документы. Для этого откройте техническую панель справа, вкладку </w:t>
       </w:r>
       <w:r>
         <w:rPr>
@@ -1971,7 +1971,7 @@
           <w:rFonts w:ascii="Aptos" w:hAnsi="Aptos" w:eastAsia="Aptos"/>
           <w:b w:val="0"/>
         </w:rPr>
-        <w:t>. Обычный пользователь видит в технической панели только сообщение о доступности общей базы без формы загрузки.</w:t>
+        <w:t>. Это право не открывает чужие проекты, чаты или системные административные API.</w:t>
       </w:r>
     </w:p>
     <w:p>
@@ -2210,7 +2210,7 @@
           <w:rFonts w:ascii="Aptos" w:hAnsi="Aptos" w:eastAsia="Aptos"/>
           <w:b w:val="0"/>
         </w:rPr>
-        <w:t xml:space="preserve"> проверьте ненулевое число чанков. Нулевое значение означает, что текст не извлечён или реестр ещё не обновился. Нажмите имя документа, чтобы открыть или скачать исходный файл. Чтобы удалить приватный документ, нажмите кнопку с корзиной справа от его строки и подтвердите действие. Документ сразу исчезает из доступной области и перестаёт участвовать в новых ответах; удаление чанков из Qdrant и BM25 и исходного файла выполняется через ту же последовательную очередь, что и индексация. Действие необратимо. Общий документ может удалить только администратор, потому что это влияет на всех пользователей.</w:t>
+        <w:t xml:space="preserve"> проверьте ненулевое число чанков. Нулевое значение означает, что текст не извлечён или реестр ещё не обновился. Нажмите имя документа, чтобы открыть или скачать исходный файл. Чтобы удалить приватный документ, нажмите кнопку с корзиной справа от его строки и подтвердите действие. Документ сразу исчезает из доступной области и перестаёт участвовать в новых ответах; удаление чанков из Qdrant и BM25 и исходного файла выполняется через ту же последовательную очередь, что и индексация. Действие необратимо. В текущей тестовой среде общий документ может удалить любой авторизованный пользователь; перед подтверждением учитывайте, что он исчезнет из ответов у всех пользователей.</w:t>
       </w:r>
     </w:p>
     <w:p>
@@ -2219,7 +2219,7 @@
           <w:rFonts w:ascii="Aptos" w:hAnsi="Aptos" w:eastAsia="Aptos"/>
           <w:b w:val="0"/>
         </w:rPr>
-        <w:t>Если после подтверждения показано сообщение, что документ скрыт, но очередь очистки недоступна, не загружайте тот же файл повторно. Он уже исключён из поиска, однако администратору нужно повторить физическую очистку по job ID.</w:t>
+        <w:t>Если после подтверждения показано сообщение, что документ скрыт, но очередь очистки недоступна, не загружайте тот же файл повторно. Он уже исключён из поиска, однако оператору нужно повторить физическую очистку по job ID.</w:t>
       </w:r>
     </w:p>
     <w:p>
@@ -2228,7 +2228,7 @@
           <w:rFonts w:ascii="Aptos" w:hAnsi="Aptos" w:eastAsia="Aptos"/>
           <w:b w:val="0"/>
         </w:rPr>
-        <w:t>Правая техническая панель не используется для проектных или чатовых файлов. Она содержит административную форму общей базы и диагностические сведения о последнем ответе.</w:t>
+        <w:t>Правая техническая панель не используется для проектных или чатовых файлов. Она содержит форму общей базы и диагностические сведения о последнем ответе.</w:t>
       </w:r>
     </w:p>
     <w:p>
@@ -2317,7 +2317,23 @@
           <w:rFonts w:ascii="Aptos" w:hAnsi="Aptos" w:eastAsia="Aptos"/>
           <w:b w:val="0"/>
         </w:rPr>
-        <w:t>Все документы, находившиеся в системе до введения персональных учётных записей, перенесены в общий корпус. Обычный пользователь не может сделать новый файл общим через проектную форму загрузки; публикация в общий корпус — отдельное административное действие. Удаление или замена общего документа влияет на всех пользователей и должно выполняться только после проверки новой редакции.</w:t>
+        <w:t xml:space="preserve">Все документы, находившиеся в системе до введения персональных учётных записей, перенесены в общий корпус. Проектная форма всегда сохраняет файл в проекте и не может сделать его общим. Для публикации используйте отдельную форму </w:t>
+      </w:r>
+      <w:r>
+        <w:rPr>
+          <w:rFonts w:ascii="Cascadia Mono" w:hAnsi="Cascadia Mono" w:eastAsia="Cascadia Mono"/>
+          <w:color w:val="17324D"/>
+          <w:sz w:val="18"/>
+          <w:shd w:fill="F3F5F7"/>
+        </w:rPr>
+        <w:t>Общая база знаний</w:t>
+      </w:r>
+      <w:r>
+        <w:rPr>
+          <w:rFonts w:ascii="Aptos" w:hAnsi="Aptos" w:eastAsia="Aptos"/>
+          <w:b w:val="0"/>
+        </w:rPr>
+        <w:t xml:space="preserve"> в технической панели; в текущей тестовой среде она доступна каждому авторизованному пользователю. Удаление или замена общего документа влияет на всех пользователей и должно выполняться только после проверки новой редакции.</w:t>
       </w:r>
     </w:p>
     <w:p>

</xml_diff>